<commit_message>
lit review: add 2 verified recent references (Chiffoleau & Dourian 2020, Herzig & Zander 2025) + regenerate DOCX
</commit_message>
<xml_diff>
--- a/outputs/word/article_vente_directe.docx
+++ b/outputs/word/article_vente_directe.docx
@@ -327,7 +327,32 @@
         <w:t xml:space="preserve">(Chiffoleau 2019; Praly et al. 2014)</w:t>
       </w:r>
       <w:r>
-        <w:t xml:space="preserve">. Ces dispositifs sont régulièrement présentés comme des leviers de relocalisation alimentaire, de soutien au revenu agricole et de reconnexion entre mangeurs et producteurs.</w:t>
+        <w:t xml:space="preserve">. Ces dispositifs sont régulièrement présentés comme des leviers de relocalisation alimentaire, de soutien au revenu agricole et de reconnexion entre mangeurs et producteurs. La crise sanitaire de 2020 a ravivé cet intérêt en plaçant la</w:t>
+      </w:r>
+      <w:r>
+        <w:t xml:space="preserve"> </w:t>
+      </w:r>
+      <w:r>
+        <w:rPr>
+          <w:b/>
+          <w:bCs/>
+        </w:rPr>
+        <w:t xml:space="preserve">résilience</w:t>
+      </w:r>
+      <w:r>
+        <w:t xml:space="preserve"> </w:t>
+      </w:r>
+      <w:r>
+        <w:t xml:space="preserve">des systèmes alimentaires courts au cœur du débat public et scientifique</w:t>
+      </w:r>
+      <w:r>
+        <w:t xml:space="preserve"> </w:t>
+      </w:r>
+      <w:r>
+        <w:t xml:space="preserve">(Chiffoleau et Dourian 2020)</w:t>
+      </w:r>
+      <w:r>
+        <w:t xml:space="preserve">, avant que l’inflation alimentaire de 2022-2024 ne réintroduise la contrainte de prix comme variable centrale des arbitrages des ménages.</w:t>
       </w:r>
     </w:p>
     <w:p>
@@ -383,6 +408,15 @@
       </w:r>
       <w:r>
         <w:t xml:space="preserve">(Dubuisson-Quellier et al. 2011; Lamine et Perrot 2008)</w:t>
+      </w:r>
+      <w:r>
+        <w:t xml:space="preserve">. Une revue systématique récente confirme la stabilité de ces motivations tout en soulignant le poids croissant des facteurs contextuels, de la confiance et de l’information — davantage que des seules variables sociodémographiques — dans le comportement d’achat en circuit court</w:t>
+      </w:r>
+      <w:r>
+        <w:t xml:space="preserve"> </w:t>
+      </w:r>
+      <w:r>
+        <w:t xml:space="preserve">(Herzig et Zander 2025)</w:t>
       </w:r>
       <w:r>
         <w:t xml:space="preserve">. Ces deux littératures, précieuses, partagent toutefois une limite : elles tendent à isoler la vente directe du reste des pratiques d’achat, comme si elle constituait un univers à part, porté par une population spécifique et animé de logiques propres.</w:t>
@@ -3962,7 +3996,16 @@
         <w:t xml:space="preserve">possibilité d’appoint largement partagée</w:t>
       </w:r>
       <w:r>
-        <w:t xml:space="preserve">.</w:t>
+        <w:t xml:space="preserve">. Ce résultat converge avec les conclusions de la revue systématique de</w:t>
+      </w:r>
+      <w:r>
+        <w:t xml:space="preserve"> </w:t>
+      </w:r>
+      <w:r>
+        <w:t xml:space="preserve">Herzig et Zander (2025)</w:t>
+      </w:r>
+      <w:r>
+        <w:t xml:space="preserve">, pour qui les variables sociodémographiques, bien que fréquemment étudiées, expliquent finalement peu le comportement d’achat en circuit court, au profit de facteurs contextuels et relationnels.</w:t>
       </w:r>
     </w:p>
     <w:bookmarkEnd w:id="35"/>
@@ -4218,7 +4261,32 @@
         <w:t xml:space="preserve">(Goodman et DuPuis 2002; Sage 2003)</w:t>
       </w:r>
       <w:r>
-        <w:t xml:space="preserve">, mais il la quantifie précisément du point de vue du consommateur.</w:t>
+        <w:t xml:space="preserve">, mais il la quantifie précisément du point de vue du consommateur. Il fait également écho aux travaux récents qui, après l’espoir suscité par la crise sanitaire de voir les circuits courts monter en puissance, constatent une</w:t>
+      </w:r>
+      <w:r>
+        <w:t xml:space="preserve"> </w:t>
+      </w:r>
+      <w:r>
+        <w:rPr>
+          <w:b/>
+          <w:bCs/>
+        </w:rPr>
+        <w:t xml:space="preserve">normalisation</w:t>
+      </w:r>
+      <w:r>
+        <w:t xml:space="preserve"> </w:t>
+      </w:r>
+      <w:r>
+        <w:t xml:space="preserve">: leur contribution durable à la transition alimentaire suppose de dépasser le statut d’appoint</w:t>
+      </w:r>
+      <w:r>
+        <w:t xml:space="preserve"> </w:t>
+      </w:r>
+      <w:r>
+        <w:t xml:space="preserve">(Chiffoleau et Dourian 2020)</w:t>
+      </w:r>
+      <w:r>
+        <w:t xml:space="preserve">.</w:t>
       </w:r>
     </w:p>
     <w:bookmarkEnd w:id="41"/>
@@ -4491,7 +4559,7 @@
       </w:r>
     </w:p>
     <w:bookmarkEnd w:id="46"/>
-    <w:bookmarkStart w:id="60" w:name="références"/>
+    <w:bookmarkStart w:id="64" w:name="références"/>
     <w:p>
       <w:pPr>
         <w:pStyle w:val="Heading1"/>
@@ -4500,7 +4568,7 @@
         <w:t xml:space="preserve">Références</w:t>
       </w:r>
     </w:p>
-    <w:bookmarkStart w:id="59" w:name="refs"/>
+    <w:bookmarkStart w:id="63" w:name="refs"/>
     <w:bookmarkStart w:id="47" w:name="ref-chiffoleau2019"/>
     <w:p>
       <w:pPr>
@@ -4524,28 +4592,31 @@
       </w:r>
     </w:p>
     <w:bookmarkEnd w:id="47"/>
-    <w:bookmarkStart w:id="48" w:name="ref-dubuisson2011"/>
+    <w:bookmarkStart w:id="49" w:name="ref-chiffoleau2020"/>
     <w:p>
       <w:pPr>
         <w:pStyle w:val="Bibliography"/>
       </w:pPr>
       <w:r>
-        <w:t xml:space="preserve">Dubuisson-Quellier, Sophie, Claire Lamine, et Ronan Le Velly. 2011.</w:t>
-      </w:r>
-      <w:r>
-        <w:t xml:space="preserve"> </w:t>
-      </w:r>
-      <w:r>
-        <w:t xml:space="preserve">« Citizenship and consumption: Mobilisation in alternative food systems in</w:t>
-      </w:r>
-      <w:r>
-        <w:t xml:space="preserve"> </w:t>
-      </w:r>
-      <w:r>
-        <w:t xml:space="preserve">France</w:t>
-      </w:r>
-      <w:r>
-        <w:t xml:space="preserve"> »</w:t>
+        <w:t xml:space="preserve">Chiffoleau, Yuna, et Tara Dourian. 2020.</w:t>
+      </w:r>
+      <w:r>
+        <w:t xml:space="preserve"> </w:t>
+      </w:r>
+      <w:r>
+        <w:t xml:space="preserve">« Sustainable food supply chains: Is shortening the answer?</w:t>
+      </w:r>
+      <w:r>
+        <w:t xml:space="preserve"> </w:t>
+      </w:r>
+      <w:r>
+        <w:t xml:space="preserve">A</w:t>
+      </w:r>
+      <w:r>
+        <w:t xml:space="preserve"> </w:t>
+      </w:r>
+      <w:r>
+        <w:t xml:space="preserve">literature review for a research and innovation agenda »</w:t>
       </w:r>
       <w:r>
         <w:t xml:space="preserve">.</w:t>
@@ -4558,29 +4629,52 @@
           <w:i/>
           <w:iCs/>
         </w:rPr>
-        <w:t xml:space="preserve">Sociologia Ruralis</w:t>
-      </w:r>
-      <w:r>
-        <w:t xml:space="preserve"> </w:t>
-      </w:r>
-      <w:r>
-        <w:t xml:space="preserve">51 (3): 304‑23.</w:t>
-      </w:r>
-    </w:p>
-    <w:bookmarkEnd w:id="48"/>
-    <w:bookmarkStart w:id="49" w:name="ref-filserplichon2004"/>
+        <w:t xml:space="preserve">Sustainability</w:t>
+      </w:r>
+      <w:r>
+        <w:t xml:space="preserve"> </w:t>
+      </w:r>
+      <w:r>
+        <w:t xml:space="preserve">12 (23): 9831.</w:t>
+      </w:r>
+      <w:r>
+        <w:t xml:space="preserve"> </w:t>
+      </w:r>
+      <w:hyperlink r:id="rId48">
+        <w:r>
+          <w:rPr>
+            <w:rStyle w:val="Hyperlink"/>
+          </w:rPr>
+          <w:t xml:space="preserve">https://doi.org/10.3390/su12239831</w:t>
+        </w:r>
+      </w:hyperlink>
+      <w:r>
+        <w:t xml:space="preserve">.</w:t>
+      </w:r>
+    </w:p>
+    <w:bookmarkEnd w:id="49"/>
+    <w:bookmarkStart w:id="50" w:name="ref-dubuisson2011"/>
     <w:p>
       <w:pPr>
         <w:pStyle w:val="Bibliography"/>
       </w:pPr>
       <w:r>
-        <w:t xml:space="preserve">Filser, Marc, et Véronique Plichon. 2004.</w:t>
-      </w:r>
-      <w:r>
-        <w:t xml:space="preserve"> </w:t>
-      </w:r>
-      <w:r>
-        <w:t xml:space="preserve">« La valeur du comportement de magasinage : statut théorique et apports au positionnement de l’enseigne »</w:t>
+        <w:t xml:space="preserve">Dubuisson-Quellier, Sophie, Claire Lamine, et Ronan Le Velly. 2011.</w:t>
+      </w:r>
+      <w:r>
+        <w:t xml:space="preserve"> </w:t>
+      </w:r>
+      <w:r>
+        <w:t xml:space="preserve">« Citizenship and consumption: Mobilisation in alternative food systems in</w:t>
+      </w:r>
+      <w:r>
+        <w:t xml:space="preserve"> </w:t>
+      </w:r>
+      <w:r>
+        <w:t xml:space="preserve">France</w:t>
+      </w:r>
+      <w:r>
+        <w:t xml:space="preserve"> »</w:t>
       </w:r>
       <w:r>
         <w:t xml:space="preserve">.</w:t>
@@ -4593,29 +4687,29 @@
           <w:i/>
           <w:iCs/>
         </w:rPr>
-        <w:t xml:space="preserve">Revue Française de Gestion</w:t>
-      </w:r>
-      <w:r>
-        <w:t xml:space="preserve"> </w:t>
-      </w:r>
-      <w:r>
-        <w:t xml:space="preserve">30 (148): 29‑43.</w:t>
-      </w:r>
-    </w:p>
-    <w:bookmarkEnd w:id="49"/>
-    <w:bookmarkStart w:id="51" w:name="ref-goodman2002"/>
+        <w:t xml:space="preserve">Sociologia Ruralis</w:t>
+      </w:r>
+      <w:r>
+        <w:t xml:space="preserve"> </w:t>
+      </w:r>
+      <w:r>
+        <w:t xml:space="preserve">51 (3): 304‑23.</w:t>
+      </w:r>
+    </w:p>
+    <w:bookmarkEnd w:id="50"/>
+    <w:bookmarkStart w:id="51" w:name="ref-filserplichon2004"/>
     <w:p>
       <w:pPr>
         <w:pStyle w:val="Bibliography"/>
       </w:pPr>
       <w:r>
-        <w:t xml:space="preserve">Goodman, David, et E. Melanie DuPuis. 2002.</w:t>
-      </w:r>
-      <w:r>
-        <w:t xml:space="preserve"> </w:t>
-      </w:r>
-      <w:r>
-        <w:t xml:space="preserve">« Knowing food and growing food: Beyond the production–consumption debate in the sociology of agriculture »</w:t>
+        <w:t xml:space="preserve">Filser, Marc, et Véronique Plichon. 2004.</w:t>
+      </w:r>
+      <w:r>
+        <w:t xml:space="preserve"> </w:t>
+      </w:r>
+      <w:r>
+        <w:t xml:space="preserve">« La valeur du comportement de magasinage : statut théorique et apports au positionnement de l’enseigne »</w:t>
       </w:r>
       <w:r>
         <w:t xml:space="preserve">.</w:t>
@@ -4628,6 +4722,41 @@
           <w:i/>
           <w:iCs/>
         </w:rPr>
+        <w:t xml:space="preserve">Revue Française de Gestion</w:t>
+      </w:r>
+      <w:r>
+        <w:t xml:space="preserve"> </w:t>
+      </w:r>
+      <w:r>
+        <w:t xml:space="preserve">30 (148): 29‑43.</w:t>
+      </w:r>
+    </w:p>
+    <w:bookmarkEnd w:id="51"/>
+    <w:bookmarkStart w:id="53" w:name="ref-goodman2002"/>
+    <w:p>
+      <w:pPr>
+        <w:pStyle w:val="Bibliography"/>
+      </w:pPr>
+      <w:r>
+        <w:t xml:space="preserve">Goodman, David, et E. Melanie DuPuis. 2002.</w:t>
+      </w:r>
+      <w:r>
+        <w:t xml:space="preserve"> </w:t>
+      </w:r>
+      <w:r>
+        <w:t xml:space="preserve">« Knowing food and growing food: Beyond the production–consumption debate in the sociology of agriculture »</w:t>
+      </w:r>
+      <w:r>
+        <w:t xml:space="preserve">.</w:t>
+      </w:r>
+      <w:r>
+        <w:t xml:space="preserve"> </w:t>
+      </w:r>
+      <w:r>
+        <w:rPr>
+          <w:i/>
+          <w:iCs/>
+        </w:rPr>
         <w:t xml:space="preserve">Sociologia Ruralis</w:t>
       </w:r>
       <w:r>
@@ -4639,7 +4768,7 @@
       <w:r>
         <w:t xml:space="preserve"> </w:t>
       </w:r>
-      <w:hyperlink r:id="rId50">
+      <w:hyperlink r:id="rId52">
         <w:r>
           <w:rPr>
             <w:rStyle w:val="Hyperlink"/>
@@ -4651,14 +4780,23 @@
         <w:t xml:space="preserve">.</w:t>
       </w:r>
     </w:p>
-    <w:bookmarkEnd w:id="51"/>
-    <w:bookmarkStart w:id="52" w:name="ref-lamine2008"/>
+    <w:bookmarkEnd w:id="53"/>
+    <w:bookmarkStart w:id="55" w:name="ref-herzig2025"/>
     <w:p>
       <w:pPr>
         <w:pStyle w:val="Bibliography"/>
       </w:pPr>
       <w:r>
-        <w:t xml:space="preserve">Lamine, Claire, et Nathalie Perrot. 2008.</w:t>
+        <w:t xml:space="preserve">Herzig, Janna, et Katrin Zander. 2025.</w:t>
+      </w:r>
+      <w:r>
+        <w:t xml:space="preserve"> </w:t>
+      </w:r>
+      <w:r>
+        <w:t xml:space="preserve">« Determinants of consumer behavior in short food supply chains: A systematic literature review »</w:t>
+      </w:r>
+      <w:r>
+        <w:t xml:space="preserve">.</w:t>
       </w:r>
       <w:r>
         <w:t xml:space="preserve"> </w:t>
@@ -4668,20 +4806,37 @@
           <w:i/>
           <w:iCs/>
         </w:rPr>
-        <w:t xml:space="preserve">Les AMAP : un nouveau pacte entre producteurs et consommateurs ?</w:t>
-      </w:r>
-      <w:r>
-        <w:t xml:space="preserve"> Yves Michel.</w:t>
-      </w:r>
-    </w:p>
-    <w:bookmarkEnd w:id="52"/>
-    <w:bookmarkStart w:id="54" w:name="ref-marechal2008"/>
+        <w:t xml:space="preserve">Agricultural and Food Economics</w:t>
+      </w:r>
+      <w:r>
+        <w:t xml:space="preserve"> </w:t>
+      </w:r>
+      <w:r>
+        <w:t xml:space="preserve">13 (1): 1‑40.</w:t>
+      </w:r>
+      <w:r>
+        <w:t xml:space="preserve"> </w:t>
+      </w:r>
+      <w:hyperlink r:id="rId54">
+        <w:r>
+          <w:rPr>
+            <w:rStyle w:val="Hyperlink"/>
+          </w:rPr>
+          <w:t xml:space="preserve">https://doi.org/10.1186/s40100-025-00370-w</w:t>
+        </w:r>
+      </w:hyperlink>
+      <w:r>
+        <w:t xml:space="preserve">.</w:t>
+      </w:r>
+    </w:p>
+    <w:bookmarkEnd w:id="55"/>
+    <w:bookmarkStart w:id="56" w:name="ref-lamine2008"/>
     <w:p>
       <w:pPr>
         <w:pStyle w:val="Bibliography"/>
       </w:pPr>
       <w:r>
-        <w:t xml:space="preserve">Maréchal, Gilles, éd. 2008.</w:t>
+        <w:t xml:space="preserve">Lamine, Claire, et Nathalie Perrot. 2008.</w:t>
       </w:r>
       <w:r>
         <w:t xml:space="preserve"> </w:t>
@@ -4691,6 +4846,29 @@
           <w:i/>
           <w:iCs/>
         </w:rPr>
+        <w:t xml:space="preserve">Les AMAP : un nouveau pacte entre producteurs et consommateurs ?</w:t>
+      </w:r>
+      <w:r>
+        <w:t xml:space="preserve"> Yves Michel.</w:t>
+      </w:r>
+    </w:p>
+    <w:bookmarkEnd w:id="56"/>
+    <w:bookmarkStart w:id="58" w:name="ref-marechal2008"/>
+    <w:p>
+      <w:pPr>
+        <w:pStyle w:val="Bibliography"/>
+      </w:pPr>
+      <w:r>
+        <w:t xml:space="preserve">Maréchal, Gilles, éd. 2008.</w:t>
+      </w:r>
+      <w:r>
+        <w:t xml:space="preserve"> </w:t>
+      </w:r>
+      <w:r>
+        <w:rPr>
+          <w:i/>
+          <w:iCs/>
+        </w:rPr>
         <w:t xml:space="preserve">Les circuits courts alimentaires : bien manger dans les territoires</w:t>
       </w:r>
       <w:r>
@@ -4699,7 +4877,7 @@
       <w:r>
         <w:t xml:space="preserve"> </w:t>
       </w:r>
-      <w:hyperlink r:id="rId53">
+      <w:hyperlink r:id="rId57">
         <w:r>
           <w:rPr>
             <w:rStyle w:val="Hyperlink"/>
@@ -4711,8 +4889,8 @@
         <w:t xml:space="preserve">.</w:t>
       </w:r>
     </w:p>
-    <w:bookmarkEnd w:id="54"/>
-    <w:bookmarkStart w:id="55" w:name="ref-maa2009"/>
+    <w:bookmarkEnd w:id="58"/>
+    <w:bookmarkStart w:id="59" w:name="ref-maa2009"/>
     <w:p>
       <w:pPr>
         <w:pStyle w:val="Bibliography"/>
@@ -4734,8 +4912,8 @@
         <w:t xml:space="preserve">. Rapport institutionnel.</w:t>
       </w:r>
     </w:p>
-    <w:bookmarkEnd w:id="55"/>
-    <w:bookmarkStart w:id="56" w:name="ref-praly2014"/>
+    <w:bookmarkEnd w:id="59"/>
+    <w:bookmarkStart w:id="60" w:name="ref-praly2014"/>
     <w:p>
       <w:pPr>
         <w:pStyle w:val="Bibliography"/>
@@ -4769,8 +4947,8 @@
         <w:t xml:space="preserve">16 (4): 455‑78.</w:t>
       </w:r>
     </w:p>
-    <w:bookmarkEnd w:id="56"/>
-    <w:bookmarkStart w:id="57" w:name="ref-sage2003"/>
+    <w:bookmarkEnd w:id="60"/>
+    <w:bookmarkStart w:id="61" w:name="ref-sage2003"/>
     <w:p>
       <w:pPr>
         <w:pStyle w:val="Bibliography"/>
@@ -4813,8 +4991,8 @@
         <w:t xml:space="preserve">19 (1): 47‑60.</w:t>
       </w:r>
     </w:p>
-    <w:bookmarkEnd w:id="57"/>
-    <w:bookmarkStart w:id="58" w:name="ref-volle2012"/>
+    <w:bookmarkEnd w:id="61"/>
+    <w:bookmarkStart w:id="62" w:name="ref-volle2012"/>
     <w:p>
       <w:pPr>
         <w:pStyle w:val="Bibliography"/>
@@ -4836,9 +5014,9 @@
         <w:t xml:space="preserve">. Pearson.</w:t>
       </w:r>
     </w:p>
-    <w:bookmarkEnd w:id="58"/>
-    <w:bookmarkEnd w:id="59"/>
-    <w:bookmarkEnd w:id="60"/>
+    <w:bookmarkEnd w:id="62"/>
+    <w:bookmarkEnd w:id="63"/>
+    <w:bookmarkEnd w:id="64"/>
     <w:sectPr>
       <w:footnotePr>
         <w:numRestart w:val="eachSect"/>

</xml_diff>

<commit_message>
typology fix: clarify inclusive vs regular VD (add VD-régulière col), correct multi-canal conventionnels characterization, consistent class numbering
</commit_message>
<xml_diff>
--- a/outputs/word/article_vente_directe.docx
+++ b/outputs/word/article_vente_directe.docx
@@ -2805,7 +2805,62 @@
         <w:t xml:space="preserve"> </w:t>
       </w:r>
       <w:r>
-        <w:t xml:space="preserve">Les cinq stratégies d’approvisionnement (profils par usage régulier, ≥ 1×/mois).</w:t>
+        <w:t xml:space="preserve">Les cinq stratégies d’approvisionnement (classes numérotées par effectif décroissant). La colonne</w:t>
+      </w:r>
+      <w:r>
+        <w:t xml:space="preserve"> </w:t>
+      </w:r>
+      <w:r>
+        <w:rPr>
+          <w:b/>
+          <w:bCs/>
+        </w:rPr>
+        <w:t xml:space="preserve">% VD</w:t>
+      </w:r>
+      <w:r>
+        <w:t xml:space="preserve"> </w:t>
+      </w:r>
+      <w:r>
+        <w:t xml:space="preserve">applique la définition inclusive (achat direct au moins occasionnel) ;</w:t>
+      </w:r>
+      <w:r>
+        <w:t xml:space="preserve"> </w:t>
+      </w:r>
+      <w:r>
+        <w:rPr>
+          <w:b/>
+          <w:bCs/>
+        </w:rPr>
+        <w:t xml:space="preserve">% VD rég.</w:t>
+      </w:r>
+      <w:r>
+        <w:t xml:space="preserve"> </w:t>
+      </w:r>
+      <w:r>
+        <w:t xml:space="preserve">ne retient que l’achat direct régulier au producteur (canal 7 au moins mensuel), ce qui sépare l’</w:t>
+      </w:r>
+      <w:r>
+        <w:rPr>
+          <w:b/>
+          <w:bCs/>
+        </w:rPr>
+        <w:t xml:space="preserve">essai ponctuel</w:t>
+      </w:r>
+      <w:r>
+        <w:t xml:space="preserve"> </w:t>
+      </w:r>
+      <w:r>
+        <w:t xml:space="preserve">de l’</w:t>
+      </w:r>
+      <w:r>
+        <w:rPr>
+          <w:b/>
+          <w:bCs/>
+        </w:rPr>
+        <w:t xml:space="preserve">usage installé</w:t>
+      </w:r>
+      <w:r>
+        <w:t xml:space="preserve">.</w:t>
       </w:r>
     </w:p>
     <w:tbl>
@@ -2816,12 +2871,13 @@
         <w:tblLook w:firstRow="1" w:lastRow="0" w:firstColumn="0" w:lastColumn="0" w:noHBand="0" w:noVBand="0" w:val="0020"/>
       </w:tblPr>
       <w:tblGrid>
-        <w:gridCol w:w="728"/>
-        <w:gridCol w:w="273"/>
-        <w:gridCol w:w="3095"/>
-        <w:gridCol w:w="1274"/>
-        <w:gridCol w:w="1547"/>
-        <w:gridCol w:w="1001"/>
+        <w:gridCol w:w="812"/>
+        <w:gridCol w:w="304"/>
+        <w:gridCol w:w="2538"/>
+        <w:gridCol w:w="1421"/>
+        <w:gridCol w:w="609"/>
+        <w:gridCol w:w="1116"/>
+        <w:gridCol w:w="1116"/>
       </w:tblGrid>
       <w:tr>
         <w:trPr>
@@ -2856,7 +2912,7 @@
               <w:pStyle w:val="Compact"/>
             </w:pPr>
             <w:r>
-              <w:t xml:space="preserve">Nombre moyen de canaux réguliers</w:t>
+              <w:t xml:space="preserve">Canaux réguliers (moy.)</w:t>
             </w:r>
           </w:p>
         </w:tc>
@@ -2878,7 +2934,18 @@
               <w:pStyle w:val="Compact"/>
             </w:pPr>
             <w:r>
-              <w:t xml:space="preserve">% vente directe</w:t>
+              <w:t xml:space="preserve">% VD</w:t>
+            </w:r>
+          </w:p>
+        </w:tc>
+        <w:tc>
+          <w:tcPr/>
+          <w:p>
+            <w:pPr>
+              <w:pStyle w:val="Compact"/>
+            </w:pPr>
+            <w:r>
+              <w:t xml:space="preserve">% VD rég.</w:t>
             </w:r>
           </w:p>
         </w:tc>
@@ -2906,7 +2973,7 @@
                 <w:b/>
                 <w:bCs/>
               </w:rPr>
-              <w:t xml:space="preserve">C5 — Généralistes</w:t>
+              <w:t xml:space="preserve">C1 — Généralistes</w:t>
             </w:r>
           </w:p>
         </w:tc>
@@ -2961,7 +3028,18 @@
               <w:pStyle w:val="Compact"/>
             </w:pPr>
             <w:r>
-              <w:t xml:space="preserve">Hypermarché + quelques compléments (artisans, discount, marché)</w:t>
+              <w:t xml:space="preserve">16 %</w:t>
+            </w:r>
+          </w:p>
+        </w:tc>
+        <w:tc>
+          <w:tcPr/>
+          <w:p>
+            <w:pPr>
+              <w:pStyle w:val="Compact"/>
+            </w:pPr>
+            <w:r>
+              <w:t xml:space="preserve">Hypermarché + quelques compléments (artisans, marché, discount)</w:t>
             </w:r>
           </w:p>
         </w:tc>
@@ -3033,7 +3111,18 @@
               <w:pStyle w:val="Compact"/>
             </w:pPr>
             <w:r>
-              <w:t xml:space="preserve">Hypermarché + discount, très peu d’alternatives</w:t>
+              <w:t xml:space="preserve">6 %</w:t>
+            </w:r>
+          </w:p>
+        </w:tc>
+        <w:tc>
+          <w:tcPr/>
+          <w:p>
+            <w:pPr>
+              <w:pStyle w:val="Compact"/>
+            </w:pPr>
+            <w:r>
+              <w:t xml:space="preserve">Hypermarché + discount ; très peu d’alternatives, même à l’essai</w:t>
             </w:r>
           </w:p>
         </w:tc>
@@ -3050,7 +3139,7 @@
                 <w:b/>
                 <w:bCs/>
               </w:rPr>
-              <w:t xml:space="preserve">C1 — Omnivores engagés</w:t>
+              <w:t xml:space="preserve">C3 — Omnivores engagés</w:t>
             </w:r>
           </w:p>
         </w:tc>
@@ -3105,92 +3194,31 @@
               <w:pStyle w:val="Compact"/>
             </w:pPr>
             <w:r>
-              <w:t xml:space="preserve">Presque tous les canaux, y compris niche (paniers, coop, vrac)</w:t>
-            </w:r>
-          </w:p>
-        </w:tc>
-      </w:tr>
-      <w:tr>
-        <w:tc>
-          <w:tcPr/>
-          <w:p>
-            <w:pPr>
-              <w:pStyle w:val="Compact"/>
-            </w:pPr>
+              <w:t xml:space="preserve">67 %</w:t>
+            </w:r>
+          </w:p>
+        </w:tc>
+        <w:tc>
+          <w:tcPr/>
+          <w:p>
+            <w:pPr>
+              <w:pStyle w:val="Compact"/>
+            </w:pPr>
+            <w:r>
+              <w:t xml:space="preserve">Presque tous les canaux</w:t>
+            </w:r>
+            <w:r>
+              <w:t xml:space="preserve"> </w:t>
+            </w:r>
             <w:r>
               <w:rPr>
                 <w:b/>
                 <w:bCs/>
               </w:rPr>
-              <w:t xml:space="preserve">C3 — Multi-canal conventionnels</w:t>
-            </w:r>
-          </w:p>
-        </w:tc>
-        <w:tc>
-          <w:tcPr/>
-          <w:p>
-            <w:pPr>
-              <w:pStyle w:val="Compact"/>
-            </w:pPr>
-            <w:r>
-              <w:t xml:space="preserve">47</w:t>
-            </w:r>
-          </w:p>
-        </w:tc>
-        <w:tc>
-          <w:tcPr/>
-          <w:p>
-            <w:pPr>
-              <w:pStyle w:val="Compact"/>
-            </w:pPr>
-            <w:r>
-              <w:t xml:space="preserve">6,0</w:t>
-            </w:r>
-          </w:p>
-        </w:tc>
-        <w:tc>
-          <w:tcPr/>
-          <w:p>
-            <w:pPr>
-              <w:pStyle w:val="Compact"/>
-            </w:pPr>
-            <w:r>
-              <w:t xml:space="preserve">480 €</w:t>
-            </w:r>
-          </w:p>
-        </w:tc>
-        <w:tc>
-          <w:tcPr/>
-          <w:p>
-            <w:pPr>
-              <w:pStyle w:val="Compact"/>
-            </w:pPr>
-            <w:r>
-              <w:t xml:space="preserve">100 %*</w:t>
-            </w:r>
-          </w:p>
-        </w:tc>
-        <w:tc>
-          <w:tcPr/>
-          <w:p>
-            <w:pPr>
-              <w:pStyle w:val="Compact"/>
-            </w:pPr>
-            <w:r>
-              <w:t xml:space="preserve">Nombreux canaux</w:t>
-            </w:r>
-            <w:r>
-              <w:t xml:space="preserve"> </w:t>
-            </w:r>
-            <w:r>
-              <w:rPr>
-                <w:i/>
-                <w:iCs/>
-              </w:rPr>
-              <w:t xml:space="preserve">mainstream</w:t>
-            </w:r>
-            <w:r>
-              <w:t xml:space="preserve">, mais évitent l’alternatif/niche</w:t>
+              <w:t xml:space="preserve">régulièrement</w:t>
+            </w:r>
+            <w:r>
+              <w:t xml:space="preserve">, y compris niche (paniers, coop, vrac)</w:t>
             </w:r>
           </w:p>
         </w:tc>
@@ -3207,7 +3235,122 @@
                 <w:b/>
                 <w:bCs/>
               </w:rPr>
-              <w:t xml:space="preserve">C4 — Hors-hypermarché</w:t>
+              <w:t xml:space="preserve">C4 — Multi-canal conventionnels</w:t>
+            </w:r>
+          </w:p>
+        </w:tc>
+        <w:tc>
+          <w:tcPr/>
+          <w:p>
+            <w:pPr>
+              <w:pStyle w:val="Compact"/>
+            </w:pPr>
+            <w:r>
+              <w:t xml:space="preserve">47</w:t>
+            </w:r>
+          </w:p>
+        </w:tc>
+        <w:tc>
+          <w:tcPr/>
+          <w:p>
+            <w:pPr>
+              <w:pStyle w:val="Compact"/>
+            </w:pPr>
+            <w:r>
+              <w:t xml:space="preserve">6,0</w:t>
+            </w:r>
+          </w:p>
+        </w:tc>
+        <w:tc>
+          <w:tcPr/>
+          <w:p>
+            <w:pPr>
+              <w:pStyle w:val="Compact"/>
+            </w:pPr>
+            <w:r>
+              <w:t xml:space="preserve">480 €</w:t>
+            </w:r>
+          </w:p>
+        </w:tc>
+        <w:tc>
+          <w:tcPr/>
+          <w:p>
+            <w:pPr>
+              <w:pStyle w:val="Compact"/>
+            </w:pPr>
+            <w:r>
+              <w:t xml:space="preserve">100 %</w:t>
+            </w:r>
+          </w:p>
+        </w:tc>
+        <w:tc>
+          <w:tcPr/>
+          <w:p>
+            <w:pPr>
+              <w:pStyle w:val="Compact"/>
+            </w:pPr>
+            <w:r>
+              <w:t xml:space="preserve">19 %</w:t>
+            </w:r>
+          </w:p>
+        </w:tc>
+        <w:tc>
+          <w:tcPr/>
+          <w:p>
+            <w:pPr>
+              <w:pStyle w:val="Compact"/>
+            </w:pPr>
+            <w:r>
+              <w:t xml:space="preserve">Ont</w:t>
+            </w:r>
+            <w:r>
+              <w:t xml:space="preserve"> </w:t>
+            </w:r>
+            <w:r>
+              <w:rPr>
+                <w:b/>
+                <w:bCs/>
+              </w:rPr>
+              <w:t xml:space="preserve">essayé</w:t>
+            </w:r>
+            <w:r>
+              <w:t xml:space="preserve"> </w:t>
+            </w:r>
+            <w:r>
+              <w:t xml:space="preserve">presque tous les canaux (niche comprise) mais panier</w:t>
+            </w:r>
+            <w:r>
+              <w:t xml:space="preserve"> </w:t>
+            </w:r>
+            <w:r>
+              <w:rPr>
+                <w:b/>
+                <w:bCs/>
+              </w:rPr>
+              <w:t xml:space="preserve">régulier</w:t>
+            </w:r>
+            <w:r>
+              <w:t xml:space="preserve"> </w:t>
+            </w:r>
+            <w:r>
+              <w:t xml:space="preserve">conventionnel</w:t>
+            </w:r>
+          </w:p>
+        </w:tc>
+      </w:tr>
+      <w:tr>
+        <w:tc>
+          <w:tcPr/>
+          <w:p>
+            <w:pPr>
+              <w:pStyle w:val="Compact"/>
+            </w:pPr>
+            <w:r>
+              <w:rPr>
+                <w:b/>
+                <w:bCs/>
+              </w:rPr>
+              <w:t xml:space="preserve">C5 — Hors-hypermarché</w:t>
             </w:r>
           </w:p>
         </w:tc>
@@ -3252,6 +3395,17 @@
             </w:pPr>
             <w:r>
               <w:t xml:space="preserve">81 %</w:t>
+            </w:r>
+          </w:p>
+        </w:tc>
+        <w:tc>
+          <w:tcPr/>
+          <w:p>
+            <w:pPr>
+              <w:pStyle w:val="Compact"/>
+            </w:pPr>
+            <w:r>
+              <w:t xml:space="preserve">8 %</w:t>
             </w:r>
           </w:p>
         </w:tc>
@@ -3356,7 +3510,23 @@
         <w:pStyle w:val="BodyText"/>
       </w:pPr>
       <w:r>
-        <w:t xml:space="preserve">Les</w:t>
+        <w:t xml:space="preserve">La lecture conjointe des deux colonnes de vente directe est essentielle : un taux inclusif élevé peut recouvrir un simple</w:t>
+      </w:r>
+      <w:r>
+        <w:t xml:space="preserve"> </w:t>
+      </w:r>
+      <w:r>
+        <w:rPr>
+          <w:b/>
+          <w:bCs/>
+        </w:rPr>
+        <w:t xml:space="preserve">essai ponctuel</w:t>
+      </w:r>
+      <w:r>
+        <w:t xml:space="preserve"> </w:t>
+      </w:r>
+      <w:r>
+        <w:t xml:space="preserve">et non un usage installé. Les</w:t>
       </w:r>
       <w:r>
         <w:t xml:space="preserve"> </w:t>
@@ -3372,7 +3542,7 @@
         <w:t xml:space="preserve"> </w:t>
       </w:r>
       <w:r>
-        <w:t xml:space="preserve">(C5, 61 % de l’échantillon) forment le cœur de la population : ils articulent l’hypermarché à quelques canaux complémentaires (artisans, marché) et recourent à la vente directe de façon modérée (72 % de pénétration, mais usage peu intensif). Les</w:t>
+        <w:t xml:space="preserve">(C1, 61 % de l’échantillon) forment le cœur de la population : ils articulent l’hypermarché à quelques canaux complémentaires (artisans, marché) et recourent à la vente directe de façon modérée (72 % l’ont pratiquée, mais 16 % seulement régulièrement). Les</w:t>
       </w:r>
       <w:r>
         <w:t xml:space="preserve"> </w:t>
@@ -3388,7 +3558,7 @@
         <w:t xml:space="preserve"> </w:t>
       </w:r>
       <w:r>
-        <w:t xml:space="preserve">(C2, 24 %) concentrent leurs achats sur l’hypermarché et le discount et se tiennent largement à l’écart des circuits alternatifs (28 % seulement pratiquent la vente directe). À l’opposé, les</w:t>
+        <w:t xml:space="preserve">(C2, 24 %) concentrent leurs achats sur l’hypermarché et le discount et se tiennent le plus à l’écart des circuits alternatifs, même à l’essai (28 % de VD inclusive, 6 % de VD régulière). À l’opposé, les</w:t>
       </w:r>
       <w:r>
         <w:t xml:space="preserve"> </w:t>
@@ -3404,7 +3574,47 @@
         <w:t xml:space="preserve"> </w:t>
       </w:r>
       <w:r>
-        <w:t xml:space="preserve">(C1, 8 %) mobilisent presque tous les canaux de façon régulière (8,9 en moyenne), y compris les plus militants (paniers, coopératives, vrac), avec le budget le plus élevé (513 €) et une pratique quasi systématique de la vente directe (97 %). Les</w:t>
+        <w:t xml:space="preserve">(C3, 8 %) mobilisent presque tous les canaux</w:t>
+      </w:r>
+      <w:r>
+        <w:t xml:space="preserve"> </w:t>
+      </w:r>
+      <w:r>
+        <w:rPr>
+          <w:b/>
+          <w:bCs/>
+        </w:rPr>
+        <w:t xml:space="preserve">de façon régulière</w:t>
+      </w:r>
+      <w:r>
+        <w:t xml:space="preserve"> </w:t>
+      </w:r>
+      <w:r>
+        <w:t xml:space="preserve">(8,9 en moyenne), y compris les plus militants (paniers, coopératives, vrac), avec le budget le plus élevé (513 €) : ce sont les</w:t>
+      </w:r>
+      <w:r>
+        <w:t xml:space="preserve"> </w:t>
+      </w:r>
+      <w:r>
+        <w:rPr>
+          <w:b/>
+          <w:bCs/>
+        </w:rPr>
+        <w:t xml:space="preserve">seuls acheteurs vraiment intensifs</w:t>
+      </w:r>
+      <w:r>
+        <w:t xml:space="preserve"> </w:t>
+      </w:r>
+      <w:r>
+        <w:t xml:space="preserve">en vente directe (67 % y recourent au moins une fois par mois).</w:t>
+      </w:r>
+    </w:p>
+    <w:p>
+      <w:pPr>
+        <w:pStyle w:val="BodyText"/>
+      </w:pPr>
+      <w:r>
+        <w:t xml:space="preserve">Le cas des</w:t>
       </w:r>
       <w:r>
         <w:t xml:space="preserve"> </w:t>
@@ -3420,23 +3630,84 @@
         <w:t xml:space="preserve"> </w:t>
       </w:r>
       <w:r>
-        <w:t xml:space="preserve">(C3, 5 %) leur ressemblent par l’intensité, mais s’en distinguent nettement par leur</w:t>
-      </w:r>
-      <w:r>
-        <w:t xml:space="preserve"> </w:t>
-      </w:r>
-      <w:r>
-        <w:rPr>
-          <w:b/>
-          <w:bCs/>
-        </w:rPr>
-        <w:t xml:space="preserve">évitement des circuits alternatifs</w:t>
-      </w:r>
-      <w:r>
-        <w:t xml:space="preserve"> </w:t>
-      </w:r>
-      <w:r>
-        <w:t xml:space="preserve">: ils fréquentent intensément l’hypermarché, le discount, les épiceries, les surgelés, le bio et le marché, mais ni les coopératives, ni le vrac, ni les paniers.</w:t>
+        <w:t xml:space="preserve">(C4, 5 %) mérite une attention particulière, car il éclaire la mécanique de la mesure. Ce groupe affiche</w:t>
+      </w:r>
+      <w:r>
+        <w:t xml:space="preserve"> </w:t>
+      </w:r>
+      <w:r>
+        <w:rPr>
+          <w:b/>
+          <w:bCs/>
+        </w:rPr>
+        <w:t xml:space="preserve">100 % de vente directe au sens inclusif</w:t>
+      </w:r>
+      <w:r>
+        <w:t xml:space="preserve"> </w:t>
+      </w:r>
+      <w:r>
+        <w:t xml:space="preserve">— mais ce chiffre traduit un</w:t>
+      </w:r>
+      <w:r>
+        <w:t xml:space="preserve"> </w:t>
+      </w:r>
+      <w:r>
+        <w:rPr>
+          <w:b/>
+          <w:bCs/>
+        </w:rPr>
+        <w:t xml:space="preserve">très large répertoire d’essai</w:t>
+      </w:r>
+      <w:r>
+        <w:t xml:space="preserve"> </w:t>
+      </w:r>
+      <w:r>
+        <w:t xml:space="preserve">plutôt qu’un engagement : ses membres ont goûté à presque tous les canaux, y compris les plus alternatifs (coopératives, vrac, paniers, essayés par 90 % d’entre eux), sans pour autant les intégrer à leurs habitudes. Leur panier</w:t>
+      </w:r>
+      <w:r>
+        <w:t xml:space="preserve"> </w:t>
+      </w:r>
+      <w:r>
+        <w:rPr>
+          <w:b/>
+          <w:bCs/>
+        </w:rPr>
+        <w:t xml:space="preserve">régulier</w:t>
+      </w:r>
+      <w:r>
+        <w:t xml:space="preserve"> </w:t>
+      </w:r>
+      <w:r>
+        <w:t xml:space="preserve">reste en effet résolument conventionnel (hypermarché, discount, épiceries, surgelés, artisans, marché), et leur vente directe</w:t>
+      </w:r>
+      <w:r>
+        <w:t xml:space="preserve"> </w:t>
+      </w:r>
+      <w:r>
+        <w:rPr>
+          <w:b/>
+          <w:bCs/>
+        </w:rPr>
+        <w:t xml:space="preserve">régulière</w:t>
+      </w:r>
+      <w:r>
+        <w:t xml:space="preserve"> </w:t>
+      </w:r>
+      <w:r>
+        <w:t xml:space="preserve">retombe à 19 %. Ils se distinguent ainsi des omnivores engagés non par l’ampleur de leur exploration, mais par le fait qu’ils n’</w:t>
+      </w:r>
+      <w:r>
+        <w:rPr>
+          <w:b/>
+          <w:bCs/>
+        </w:rPr>
+        <w:t xml:space="preserve">installent pas</w:t>
+      </w:r>
+      <w:r>
+        <w:t xml:space="preserve"> </w:t>
+      </w:r>
+      <w:r>
+        <w:t xml:space="preserve">les circuits alternatifs dans leur routine.</w:t>
       </w:r>
     </w:p>
     <w:p>
@@ -3460,7 +3731,7 @@
         <w:t xml:space="preserve"> </w:t>
       </w:r>
       <w:r>
-        <w:t xml:space="preserve">(C4, 2,5 %) sont les</w:t>
+        <w:t xml:space="preserve">(C5, 2,5 %) sont les</w:t>
       </w:r>
       <w:r>
         <w:t xml:space="preserve"> </w:t>
@@ -3510,7 +3781,39 @@
         <w:pStyle w:val="FirstParagraph"/>
       </w:pPr>
       <w:r>
-        <w:t xml:space="preserve">Les classes diffèrent significativement par la catégorie socioprofessionnelle (χ², p &lt; 0,001) et par l’âge (p = 0,005). Les omnivores engagés (C1) et les multi-canal conventionnels (C3) sur-représentent les cadres et professions intermédiaires et disposent des budgets les plus élevés. Les captifs de la grande distribution (C2) et les généralistes (C5) reflètent davantage la structure moyenne de la population. Le groupe hors-hypermarché (C4) se distingue par sa part élevée de retraités et son budget réduit. Le taux de pratique de la vente directe croît avec l’intensité multi-canal de la stratégie, depuis 28 % (C2) jusqu’à 97-100 % (C1, C3).</w:t>
+        <w:t xml:space="preserve">Les classes diffèrent significativement par la catégorie socioprofessionnelle (χ², p &lt; 0,001) et par l’âge (p = 0,005). Les omnivores engagés (C3) et les multi-canal conventionnels (C4) sur-représentent les cadres et professions intermédiaires et disposent des budgets les plus élevés. Les captifs de la grande distribution (C2) et les généralistes (C1) reflètent davantage la structure moyenne de la population. Le groupe hors-hypermarché (C5) se distingue par sa part élevée de retraités et son budget réduit. Le taux de pratique de la vente directe</w:t>
+      </w:r>
+      <w:r>
+        <w:t xml:space="preserve"> </w:t>
+      </w:r>
+      <w:r>
+        <w:rPr>
+          <w:i/>
+          <w:iCs/>
+        </w:rPr>
+        <w:t xml:space="preserve">au sens inclusif</w:t>
+      </w:r>
+      <w:r>
+        <w:t xml:space="preserve"> </w:t>
+      </w:r>
+      <w:r>
+        <w:t xml:space="preserve">croît avec l’ampleur du répertoire de canaux, de 28 % (C2) à 100 % (C4) ; mais la vente directe</w:t>
+      </w:r>
+      <w:r>
+        <w:t xml:space="preserve"> </w:t>
+      </w:r>
+      <w:r>
+        <w:rPr>
+          <w:i/>
+          <w:iCs/>
+        </w:rPr>
+        <w:t xml:space="preserve">régulière</w:t>
+      </w:r>
+      <w:r>
+        <w:t xml:space="preserve"> </w:t>
+      </w:r>
+      <w:r>
+        <w:t xml:space="preserve">culmine chez les seuls omnivores engagés (C3, 67 %), soulignant que largeur du répertoire et intensité d’engagement ne se confondent pas.</w:t>
       </w:r>
     </w:p>
     <w:bookmarkEnd w:id="31"/>
@@ -4386,7 +4689,65 @@
         <w:t xml:space="preserve"> </w:t>
       </w:r>
       <w:r>
-        <w:t xml:space="preserve">dans laquelle elle s’inscrit. Les omnivores engagés l’intègrent à un répertoire dense de canaux ; les captifs de la grande distribution s’en tiennent à distance ; les ménages hors-hypermarché en font un pivot par défaut. Cette grille pourrait être réinvestie pour d’autres canaux alternatifs (bio, vrac, anti-gaspillage) et pour suivre, dans le temps, les recompositions des répertoires d’achat.</w:t>
+        <w:t xml:space="preserve">dans laquelle elle s’inscrit. Les omnivores engagés l’</w:t>
+      </w:r>
+      <w:r>
+        <w:rPr>
+          <w:b/>
+          <w:bCs/>
+        </w:rPr>
+        <w:t xml:space="preserve">installent</w:t>
+      </w:r>
+      <w:r>
+        <w:t xml:space="preserve"> </w:t>
+      </w:r>
+      <w:r>
+        <w:t xml:space="preserve">dans une routine multi-canal dense ; les captifs de la grande distribution s’en tiennent à distance, même à l’essai ; les multi-canal conventionnels l’</w:t>
+      </w:r>
+      <w:r>
+        <w:rPr>
+          <w:b/>
+          <w:bCs/>
+        </w:rPr>
+        <w:t xml:space="preserve">essaient</w:t>
+      </w:r>
+      <w:r>
+        <w:t xml:space="preserve"> </w:t>
+      </w:r>
+      <w:r>
+        <w:t xml:space="preserve">largement sans l’intégrer à leurs habitudes ; les ménages hors-hypermarché s’organisent autour du marché et des commerces de proximité. La distinction entre</w:t>
+      </w:r>
+      <w:r>
+        <w:t xml:space="preserve"> </w:t>
+      </w:r>
+      <w:r>
+        <w:rPr>
+          <w:b/>
+          <w:bCs/>
+        </w:rPr>
+        <w:t xml:space="preserve">essai ponctuel</w:t>
+      </w:r>
+      <w:r>
+        <w:t xml:space="preserve"> </w:t>
+      </w:r>
+      <w:r>
+        <w:t xml:space="preserve">et</w:t>
+      </w:r>
+      <w:r>
+        <w:t xml:space="preserve"> </w:t>
+      </w:r>
+      <w:r>
+        <w:rPr>
+          <w:b/>
+          <w:bCs/>
+        </w:rPr>
+        <w:t xml:space="preserve">usage installé</w:t>
+      </w:r>
+      <w:r>
+        <w:t xml:space="preserve"> </w:t>
+      </w:r>
+      <w:r>
+        <w:t xml:space="preserve">— que révèle l’écart entre vente directe inclusive et régulière — apparaît ainsi comme un ressort central de ces configurations, et une variable-clé pour qui veut faire passer la vente directe du répertoire d’appoint au socle de l’approvisionnement. Cette grille pourrait être réinvestie pour d’autres canaux alternatifs (bio, vrac, anti-gaspillage) et pour suivre, dans le temps, les recompositions des répertoires d’achat.</w:t>
       </w:r>
     </w:p>
     <w:bookmarkEnd w:id="43"/>

</xml_diff>

<commit_message>
lit review: expand section 2 into 4-pillar state of the art + positioning table + 9 verified refs + hypothesis H3 (attitude-behaviour gap)
</commit_message>
<xml_diff>
--- a/outputs/word/article_vente_directe.docx
+++ b/outputs/word/article_vente_directe.docx
@@ -569,7 +569,81 @@
         <w:t xml:space="preserve">conceptuel</w:t>
       </w:r>
       <w:r>
-        <w:t xml:space="preserve">, il importe le cadre du portefeuille de canaux dans l’étude des circuits courts, montrant que la vente directe se comprend mieux comme un</w:t>
+        <w:t xml:space="preserve">, il se situe au croisement de trois courants — le</w:t>
+      </w:r>
+      <w:r>
+        <w:t xml:space="preserve"> </w:t>
+      </w:r>
+      <w:r>
+        <w:rPr>
+          <w:b/>
+          <w:bCs/>
+        </w:rPr>
+        <w:t xml:space="preserve">comportement omnicanal</w:t>
+      </w:r>
+      <w:r>
+        <w:t xml:space="preserve">, la</w:t>
+      </w:r>
+      <w:r>
+        <w:t xml:space="preserve"> </w:t>
+      </w:r>
+      <w:r>
+        <w:rPr>
+          <w:b/>
+          <w:bCs/>
+        </w:rPr>
+        <w:t xml:space="preserve">consommation alimentaire durable</w:t>
+      </w:r>
+      <w:r>
+        <w:t xml:space="preserve"> </w:t>
+      </w:r>
+      <w:r>
+        <w:t xml:space="preserve">et la</w:t>
+      </w:r>
+      <w:r>
+        <w:t xml:space="preserve"> </w:t>
+      </w:r>
+      <w:r>
+        <w:rPr>
+          <w:b/>
+          <w:bCs/>
+        </w:rPr>
+        <w:t xml:space="preserve">segmentation du consommateur</w:t>
+      </w:r>
+      <w:r>
+        <w:t xml:space="preserve"> </w:t>
+      </w:r>
+      <w:r>
+        <w:t xml:space="preserve">— dont il opère un déplacement commun : passer du</w:t>
+      </w:r>
+      <w:r>
+        <w:t xml:space="preserve"> </w:t>
+      </w:r>
+      <w:r>
+        <w:rPr>
+          <w:b/>
+          <w:bCs/>
+        </w:rPr>
+        <w:t xml:space="preserve">déclaratif</w:t>
+      </w:r>
+      <w:r>
+        <w:t xml:space="preserve"> </w:t>
+      </w:r>
+      <w:r>
+        <w:t xml:space="preserve">(attitudes, intentions, consentement à payer) à l’</w:t>
+      </w:r>
+      <w:r>
+        <w:rPr>
+          <w:b/>
+          <w:bCs/>
+        </w:rPr>
+        <w:t xml:space="preserve">allocation budgétaire réelle</w:t>
+      </w:r>
+      <w:r>
+        <w:t xml:space="preserve"> </w:t>
+      </w:r>
+      <w:r>
+        <w:t xml:space="preserve">entre canaux. La vente directe s’y révèle moins une pratique de niche qu’un</w:t>
       </w:r>
       <w:r>
         <w:t xml:space="preserve"> </w:t>
@@ -585,11 +659,11 @@
         <w:t xml:space="preserve"> </w:t>
       </w:r>
       <w:r>
-        <w:t xml:space="preserve">que comme une pratique de niche.</w:t>
+        <w:t xml:space="preserve">inscrit dans des portefeuilles d’approvisionnement pluriels.</w:t>
       </w:r>
     </w:p>
     <w:bookmarkEnd w:id="10"/>
-    <w:bookmarkStart w:id="14" w:name="cadre-conceptuel"/>
+    <w:bookmarkStart w:id="16" w:name="cadre-conceptuel"/>
     <w:p>
       <w:pPr>
         <w:pStyle w:val="Heading1"/>
@@ -598,13 +672,21 @@
         <w:t xml:space="preserve">2. Cadre conceptuel</w:t>
       </w:r>
     </w:p>
-    <w:bookmarkStart w:id="11" w:name="Xe62b54b319222199ab5317e2862d85563cbb51b"/>
+    <w:p>
+      <w:pPr>
+        <w:pStyle w:val="FirstParagraph"/>
+      </w:pPr>
+      <w:r>
+        <w:t xml:space="preserve">L’article se construit à la croisée de quatre littératures : la caractérisation des circuits courts, le comportement omnicanal en distribution, la consommation alimentaire durable et la segmentation du consommateur. Chacune est ici sollicitée pour un apport précis, résumé dans le tableau 1.</w:t>
+      </w:r>
+    </w:p>
+    <w:bookmarkStart w:id="11" w:name="Xd16a5961338c61c8a2c80cf7fb31a921670bd03"/>
     <w:p>
       <w:pPr>
         <w:pStyle w:val="Heading2"/>
       </w:pPr>
       <w:r>
-        <w:t xml:space="preserve">2.1 Les circuits courts et la vente directe : définitions</w:t>
+        <w:t xml:space="preserve">2.1 La vente directe, sous-ensemble des circuits courts</w:t>
       </w:r>
     </w:p>
     <w:p>
@@ -659,7 +741,43 @@
         <w:t xml:space="preserve">(Dubuisson-Quellier et al. 2011)</w:t>
       </w:r>
       <w:r>
-        <w:t xml:space="preserve">.</w:t>
+        <w:t xml:space="preserve">. À l’échelle européenne, l’état des lieux socio-économique dressé par</w:t>
+      </w:r>
+      <w:r>
+        <w:t xml:space="preserve"> </w:t>
+      </w:r>
+      <w:r>
+        <w:t xml:space="preserve">Kneafsey et al. (2013)</w:t>
+      </w:r>
+      <w:r>
+        <w:t xml:space="preserve"> </w:t>
+      </w:r>
+      <w:r>
+        <w:t xml:space="preserve">confirme l’hétérogénéité de ces dispositifs et la faiblesse persistante des données représentatives sur leur diffusion réelle auprès des ménages — un déficit que la présente enquête vise à combler. Les travaux de synthèse français</w:t>
+      </w:r>
+      <w:r>
+        <w:t xml:space="preserve"> </w:t>
+      </w:r>
+      <w:r>
+        <w:t xml:space="preserve">(Chiffoleau 2019; Praly et al. 2014)</w:t>
+      </w:r>
+      <w:r>
+        <w:t xml:space="preserve"> </w:t>
+      </w:r>
+      <w:r>
+        <w:t xml:space="preserve">et la relecture post-pandémique de</w:t>
+      </w:r>
+      <w:r>
+        <w:t xml:space="preserve"> </w:t>
+      </w:r>
+      <w:r>
+        <w:t xml:space="preserve">Chiffoleau et Dourian (2020)</w:t>
+      </w:r>
+      <w:r>
+        <w:t xml:space="preserve"> </w:t>
+      </w:r>
+      <w:r>
+        <w:t xml:space="preserve">confirment par ailleurs une portée symbolique de la vente directe très supérieure à son poids économique.</w:t>
       </w:r>
     </w:p>
     <w:p>
@@ -703,13 +821,13 @@
       </w:r>
     </w:p>
     <w:bookmarkEnd w:id="11"/>
-    <w:bookmarkStart w:id="12" w:name="du-canal-isolé-au-portefeuille-de-canaux"/>
+    <w:bookmarkStart w:id="12" w:name="Xc566e5f34d5c343ee11f2a4890d4e0921d125ce"/>
     <w:p>
       <w:pPr>
         <w:pStyle w:val="Heading2"/>
       </w:pPr>
       <w:r>
-        <w:t xml:space="preserve">2.2 Du canal isolé au portefeuille de canaux</w:t>
+        <w:t xml:space="preserve">2.2 L’approvisionnement alimentaire comme comportement omnicanal</w:t>
       </w:r>
     </w:p>
     <w:p>
@@ -717,33 +835,122 @@
         <w:pStyle w:val="FirstParagraph"/>
       </w:pPr>
       <w:r>
-        <w:t xml:space="preserve">La littérature en marketing de la distribution a montré de longue date que les consommateurs ne sont pas fidèles à un format unique mais</w:t>
-      </w:r>
-      <w:r>
-        <w:t xml:space="preserve"> </w:t>
-      </w:r>
-      <w:r>
-        <w:rPr>
-          <w:b/>
-          <w:bCs/>
-        </w:rPr>
-        <w:t xml:space="preserve">fréquentent simultanément plusieurs enseignes et formats</w:t>
-      </w:r>
-      <w:r>
-        <w:t xml:space="preserve"> </w:t>
-      </w:r>
-      <w:r>
-        <w:t xml:space="preserve">(</w:t>
+        <w:t xml:space="preserve">Un premier apport consiste à lire l’approvisionnement des ménages avec les outils du</w:t>
+      </w:r>
+      <w:r>
+        <w:t xml:space="preserve"> </w:t>
+      </w:r>
+      <w:r>
+        <w:rPr>
+          <w:b/>
+          <w:bCs/>
+        </w:rPr>
+        <w:t xml:space="preserve">comportement omnicanal</w:t>
+      </w:r>
+      <w:r>
+        <w:t xml:space="preserve">, largement développés en distribution mais rarement appliqués à l’alimentation locale. La littérature a d’abord établi que les consommateurs ne sont pas fidèles à un format unique : ils</w:t>
+      </w:r>
+      <w:r>
+        <w:t xml:space="preserve"> </w:t>
+      </w:r>
+      <w:r>
+        <w:rPr>
+          <w:b/>
+          <w:bCs/>
+        </w:rPr>
+        <w:t xml:space="preserve">combinent plusieurs canaux</w:t>
+      </w:r>
+      <w:r>
+        <w:t xml:space="preserve"> </w:t>
+      </w:r>
+      <w:r>
+        <w:t xml:space="preserve">pour des fonctions distinctes (</w:t>
       </w:r>
       <w:r>
         <w:rPr>
           <w:i/>
           <w:iCs/>
         </w:rPr>
+        <w:t xml:space="preserve">multichannel customer management</w:t>
+      </w:r>
+      <w:r>
+        <w:t xml:space="preserve">), ce qui pose des enjeux spécifiques de coordination et d’allocation</w:t>
+      </w:r>
+      <w:r>
+        <w:t xml:space="preserve"> </w:t>
+      </w:r>
+      <w:r>
+        <w:t xml:space="preserve">(Neslin et al. 2006)</w:t>
+      </w:r>
+      <w:r>
+        <w:t xml:space="preserve">. Le passage du</w:t>
+      </w:r>
+      <w:r>
+        <w:t xml:space="preserve"> </w:t>
+      </w:r>
+      <w:r>
+        <w:rPr>
+          <w:i/>
+          <w:iCs/>
+        </w:rPr>
+        <w:t xml:space="preserve">multicanal</w:t>
+      </w:r>
+      <w:r>
+        <w:t xml:space="preserve"> </w:t>
+      </w:r>
+      <w:r>
+        <w:t xml:space="preserve">à l’</w:t>
+      </w:r>
+      <w:r>
+        <w:rPr>
+          <w:i/>
+          <w:iCs/>
+        </w:rPr>
+        <w:t xml:space="preserve">omnicanal</w:t>
+      </w:r>
+      <w:r>
+        <w:t xml:space="preserve"> </w:t>
+      </w:r>
+      <w:r>
+        <w:t xml:space="preserve">(Verhoef et al. 2015)</w:t>
+      </w:r>
+      <w:r>
+        <w:t xml:space="preserve"> </w:t>
+      </w:r>
+      <w:r>
+        <w:t xml:space="preserve">a ensuite déplacé l’attention de la juxtaposition des canaux vers leur</w:t>
+      </w:r>
+      <w:r>
+        <w:t xml:space="preserve"> </w:t>
+      </w:r>
+      <w:r>
+        <w:rPr>
+          <w:b/>
+          <w:bCs/>
+        </w:rPr>
+        <w:t xml:space="preserve">intégration</w:t>
+      </w:r>
+      <w:r>
+        <w:t xml:space="preserve"> </w:t>
+      </w:r>
+      <w:r>
+        <w:t xml:space="preserve">dans un parcours d’achat unifié, où le consommateur arbitre en continu entre points de vente selon le produit, le moment et le contexte. En France, les travaux sur le</w:t>
+      </w:r>
+      <w:r>
+        <w:t xml:space="preserve"> </w:t>
+      </w:r>
+      <w:r>
+        <w:rPr>
+          <w:i/>
+          <w:iCs/>
+        </w:rPr>
         <w:t xml:space="preserve">cross-shopping</w:t>
       </w:r>
       <w:r>
-        <w:t xml:space="preserve">), répartissant leurs achats selon une logique de complémentarité</w:t>
+        <w:t xml:space="preserve"> </w:t>
+      </w:r>
+      <w:r>
+        <w:t xml:space="preserve">et la valeur du magasinage</w:t>
       </w:r>
       <w:r>
         <w:t xml:space="preserve"> </w:t>
@@ -752,20 +959,10 @@
         <w:t xml:space="preserve">(Volle 2012; Filser et Plichon 2004)</w:t>
       </w:r>
       <w:r>
-        <w:t xml:space="preserve">. Le ménage gère ainsi un</w:t>
-      </w:r>
-      <w:r>
-        <w:t xml:space="preserve"> </w:t>
-      </w:r>
-      <w:r>
-        <w:rPr>
-          <w:b/>
-          <w:bCs/>
-        </w:rPr>
-        <w:t xml:space="preserve">portefeuille de canaux</w:t>
-      </w:r>
-      <w:r>
-        <w:t xml:space="preserve">, c’est-à-dire un ensemble de lieux d’achat mobilisés pour des fonctions différentes : l’hypermarché pour le gros des courses et les prix, l’artisan pour la qualité de certains produits, le marché pour le frais et le plaisir, etc.</w:t>
+        <w:t xml:space="preserve"> </w:t>
+      </w:r>
+      <w:r>
+        <w:t xml:space="preserve">avaient déjà documenté cette pluralité des fréquentations.</w:t>
       </w:r>
     </w:p>
     <w:p>
@@ -773,23 +970,23 @@
         <w:pStyle w:val="BodyText"/>
       </w:pPr>
       <w:r>
-        <w:t xml:space="preserve">Appliqué aux circuits courts, ce cadre suggère que la vente directe n’est pas en concurrence frontale avec la grande distribution, mais qu’elle</w:t>
-      </w:r>
-      <w:r>
-        <w:t xml:space="preserve"> </w:t>
-      </w:r>
-      <w:r>
-        <w:rPr>
-          <w:b/>
-          <w:bCs/>
-        </w:rPr>
-        <w:t xml:space="preserve">occupe une fonction spécifique</w:t>
-      </w:r>
-      <w:r>
-        <w:t xml:space="preserve"> </w:t>
-      </w:r>
-      <w:r>
-        <w:t xml:space="preserve">dans le portefeuille — typiquement, l’approvisionnement de certaines catégories de produits (légumes, œufs, fromages, viande) valorisées pour leur fraîcheur ou leur origine. La question n’est alors plus « pourquoi acheter en vente directe ? » mais «</w:t>
+        <w:t xml:space="preserve">Transposé aux circuits courts, ce cadre suggère que la vente directe n’entre pas en concurrence frontale avec la grande distribution : elle</w:t>
+      </w:r>
+      <w:r>
+        <w:t xml:space="preserve"> </w:t>
+      </w:r>
+      <w:r>
+        <w:rPr>
+          <w:b/>
+          <w:bCs/>
+        </w:rPr>
+        <w:t xml:space="preserve">occupe une fonction particulière</w:t>
+      </w:r>
+      <w:r>
+        <w:t xml:space="preserve"> </w:t>
+      </w:r>
+      <w:r>
+        <w:t xml:space="preserve">dans un portefeuille de canaux — l’approvisionnement de certaines catégories de produits (légumes, œufs, fromages, viande) valorisées pour leur fraîcheur ou leur origine. La question pertinente n’est alors plus « pourquoi acheter en vente directe ? », mais «</w:t>
       </w:r>
       <w:r>
         <w:t xml:space="preserve"> </w:t>
@@ -805,17 +1002,17 @@
         <w:t xml:space="preserve"> </w:t>
       </w:r>
       <w:r>
-        <w:t xml:space="preserve">la vente directe occupe-t-elle dans un portefeuille plus large ? ».</w:t>
+        <w:t xml:space="preserve">la vente directe occupe-t-elle dans le portefeuille du ménage ? ». À notre connaissance, l’application explicite du cadre omnicanal à l’alimentation directe et locale reste inédite ; c’est le premier déplacement que propose l’article.</w:t>
       </w:r>
     </w:p>
     <w:bookmarkEnd w:id="12"/>
-    <w:bookmarkStart w:id="13" w:name="hypothèses"/>
+    <w:bookmarkStart w:id="13" w:name="Xfdaa762ad32ed6d53ea2505bfee84bf6f467048"/>
     <w:p>
       <w:pPr>
         <w:pStyle w:val="Heading2"/>
       </w:pPr>
       <w:r>
-        <w:t xml:space="preserve">2.3 Hypothèses</w:t>
+        <w:t xml:space="preserve">2.3 Consommation durable : de l’intention déclarée à l’allocation budgétaire</w:t>
       </w:r>
     </w:p>
     <w:p>
@@ -823,7 +1020,686 @@
         <w:pStyle w:val="FirstParagraph"/>
       </w:pPr>
       <w:r>
-        <w:t xml:space="preserve">De ce cadre découlent deux hypothèses, que l’analyse empirique met à l’épreuve.</w:t>
+        <w:t xml:space="preserve">La littérature sur la</w:t>
+      </w:r>
+      <w:r>
+        <w:t xml:space="preserve"> </w:t>
+      </w:r>
+      <w:r>
+        <w:rPr>
+          <w:b/>
+          <w:bCs/>
+        </w:rPr>
+        <w:t xml:space="preserve">consommation alimentaire durable</w:t>
+      </w:r>
+      <w:r>
+        <w:t xml:space="preserve"> </w:t>
+      </w:r>
+      <w:r>
+        <w:t xml:space="preserve">a massivement documenté les motivations d’achat en circuit court — qualité, fraîcheur, confiance, soutien à l’économie locale, préoccupation environnementale et éthique</w:t>
+      </w:r>
+      <w:r>
+        <w:t xml:space="preserve"> </w:t>
+      </w:r>
+      <w:r>
+        <w:t xml:space="preserve">(Dubuisson-Quellier et al. 2011; Birch et al. 2018)</w:t>
+      </w:r>
+      <w:r>
+        <w:t xml:space="preserve">. Plusieurs travaux mobilisent la théorie du comportement planifié pour relier attitudes, normes et intentions à l’achat, en insistant sur le rôle central de la</w:t>
+      </w:r>
+      <w:r>
+        <w:t xml:space="preserve"> </w:t>
+      </w:r>
+      <w:r>
+        <w:rPr>
+          <w:b/>
+          <w:bCs/>
+        </w:rPr>
+        <w:t xml:space="preserve">confiance</w:t>
+      </w:r>
+      <w:r>
+        <w:t xml:space="preserve"> </w:t>
+      </w:r>
+      <w:r>
+        <w:t xml:space="preserve">envers le producteur</w:t>
+      </w:r>
+      <w:r>
+        <w:t xml:space="preserve"> </w:t>
+      </w:r>
+      <w:r>
+        <w:t xml:space="preserve">(Giampietri et al. 2016, 2018)</w:t>
+      </w:r>
+      <w:r>
+        <w:t xml:space="preserve">. Ces recherches partagent toutefois une limite bien identifiée : le fameux</w:t>
+      </w:r>
+      <w:r>
+        <w:t xml:space="preserve"> </w:t>
+      </w:r>
+      <w:r>
+        <w:rPr>
+          <w:b/>
+          <w:bCs/>
+        </w:rPr>
+        <w:t xml:space="preserve">écart entre attitude et comportement</w:t>
+      </w:r>
+      <w:r>
+        <w:t xml:space="preserve"> </w:t>
+      </w:r>
+      <w:r>
+        <w:t xml:space="preserve">(</w:t>
+      </w:r>
+      <w:r>
+        <w:rPr>
+          <w:i/>
+          <w:iCs/>
+        </w:rPr>
+        <w:t xml:space="preserve">attitude-behaviour gap</w:t>
+      </w:r>
+      <w:r>
+        <w:t xml:space="preserve">), selon lequel des attitudes très favorables ne se traduisent pas mécaniquement en achats effectifs</w:t>
+      </w:r>
+      <w:r>
+        <w:t xml:space="preserve"> </w:t>
+      </w:r>
+      <w:r>
+        <w:t xml:space="preserve">(Vermeir et Verbeke 2006)</w:t>
+      </w:r>
+      <w:r>
+        <w:t xml:space="preserve">. La revue de</w:t>
+      </w:r>
+      <w:r>
+        <w:t xml:space="preserve"> </w:t>
+      </w:r>
+      <w:r>
+        <w:t xml:space="preserve">Feldmann et Hamm (2015)</w:t>
+      </w:r>
+      <w:r>
+        <w:t xml:space="preserve"> </w:t>
+      </w:r>
+      <w:r>
+        <w:t xml:space="preserve">précise d’ailleurs que, contrairement au bio, l’alimentation locale n’est pas d’abord perçue comme chère : les principaux freins sont l’</w:t>
+      </w:r>
+      <w:r>
+        <w:rPr>
+          <w:b/>
+          <w:bCs/>
+        </w:rPr>
+        <w:t xml:space="preserve">inconvenance</w:t>
+      </w:r>
+      <w:r>
+        <w:t xml:space="preserve"> </w:t>
+      </w:r>
+      <w:r>
+        <w:t xml:space="preserve">et le</w:t>
+      </w:r>
+      <w:r>
+        <w:t xml:space="preserve"> </w:t>
+      </w:r>
+      <w:r>
+        <w:rPr>
+          <w:b/>
+          <w:bCs/>
+        </w:rPr>
+        <w:t xml:space="preserve">manque de disponibilité</w:t>
+      </w:r>
+      <w:r>
+        <w:t xml:space="preserve"> </w:t>
+      </w:r>
+      <w:r>
+        <w:t xml:space="preserve">— soit des obstacles pratiques plus que financiers.</w:t>
+      </w:r>
+    </w:p>
+    <w:p>
+      <w:pPr>
+        <w:pStyle w:val="BodyText"/>
+      </w:pPr>
+      <w:r>
+        <w:t xml:space="preserve">Or la plupart de ces études mesurent des</w:t>
+      </w:r>
+      <w:r>
+        <w:t xml:space="preserve"> </w:t>
+      </w:r>
+      <w:r>
+        <w:rPr>
+          <w:b/>
+          <w:bCs/>
+        </w:rPr>
+        <w:t xml:space="preserve">intentions</w:t>
+      </w:r>
+      <w:r>
+        <w:t xml:space="preserve">, des</w:t>
+      </w:r>
+      <w:r>
+        <w:t xml:space="preserve"> </w:t>
+      </w:r>
+      <w:r>
+        <w:rPr>
+          <w:b/>
+          <w:bCs/>
+        </w:rPr>
+        <w:t xml:space="preserve">attitudes</w:t>
+      </w:r>
+      <w:r>
+        <w:t xml:space="preserve"> </w:t>
+      </w:r>
+      <w:r>
+        <w:t xml:space="preserve">ou un</w:t>
+      </w:r>
+      <w:r>
+        <w:t xml:space="preserve"> </w:t>
+      </w:r>
+      <w:r>
+        <w:rPr>
+          <w:b/>
+          <w:bCs/>
+        </w:rPr>
+        <w:t xml:space="preserve">consentement à payer</w:t>
+      </w:r>
+      <w:r>
+        <w:t xml:space="preserve"> </w:t>
+      </w:r>
+      <w:r>
+        <w:t xml:space="preserve">hypothétique, rarement des comportements d’achat effectifs. La méta-analyse de</w:t>
+      </w:r>
+      <w:r>
+        <w:t xml:space="preserve"> </w:t>
+      </w:r>
+      <w:r>
+        <w:t xml:space="preserve">Mustapa et Kallas (2025)</w:t>
+      </w:r>
+      <w:r>
+        <w:t xml:space="preserve"> </w:t>
+      </w:r>
+      <w:r>
+        <w:t xml:space="preserve">estime ainsi à +34,5 % la prime moyenne que les consommateurs se déclarent prêts à payer pour un produit de circuit court — un chiffre à confronter à la part de budget réellement consacrée. Le second déplacement de l’article consiste précisément à quitter le registre déclaratif pour mesurer l’</w:t>
+      </w:r>
+      <w:r>
+        <w:rPr>
+          <w:b/>
+          <w:bCs/>
+        </w:rPr>
+        <w:t xml:space="preserve">allocation budgétaire réelle</w:t>
+      </w:r>
+      <w:r>
+        <w:t xml:space="preserve"> </w:t>
+      </w:r>
+      <w:r>
+        <w:t xml:space="preserve">entre canaux : combien, concrètement, le ménage consacre-t-il à la vente directe, et non combien il dit vouloir y consacrer.</w:t>
+      </w:r>
+    </w:p>
+    <w:bookmarkEnd w:id="13"/>
+    <w:bookmarkStart w:id="14" w:name="X17251f6d1ead555c1f0db4a56380563248f3e45"/>
+    <w:p>
+      <w:pPr>
+        <w:pStyle w:val="Heading2"/>
+      </w:pPr>
+      <w:r>
+        <w:t xml:space="preserve">2.4 Segmenter les acheteurs de circuits courts</w:t>
+      </w:r>
+    </w:p>
+    <w:p>
+      <w:pPr>
+        <w:pStyle w:val="FirstParagraph"/>
+      </w:pPr>
+      <w:r>
+        <w:t xml:space="preserve">Un troisième courant cherche à</w:t>
+      </w:r>
+      <w:r>
+        <w:t xml:space="preserve"> </w:t>
+      </w:r>
+      <w:r>
+        <w:rPr>
+          <w:b/>
+          <w:bCs/>
+        </w:rPr>
+        <w:t xml:space="preserve">segmenter</w:t>
+      </w:r>
+      <w:r>
+        <w:t xml:space="preserve"> </w:t>
+      </w:r>
+      <w:r>
+        <w:t xml:space="preserve">les consommateurs de produits locaux ou de circuits courts. Les revues récentes montrent que cette segmentation s’appuie le plus souvent sur des attitudes, des motivations ou des variables sociodémographiques</w:t>
+      </w:r>
+      <w:r>
+        <w:t xml:space="preserve"> </w:t>
+      </w:r>
+      <w:r>
+        <w:t xml:space="preserve">(Feldmann et Hamm 2015)</w:t>
+      </w:r>
+      <w:r>
+        <w:t xml:space="preserve">. La revue systématique de</w:t>
+      </w:r>
+      <w:r>
+        <w:t xml:space="preserve"> </w:t>
+      </w:r>
+      <w:r>
+        <w:t xml:space="preserve">Herzig et Zander (2025)</w:t>
+      </w:r>
+      <w:r>
+        <w:t xml:space="preserve"> </w:t>
+      </w:r>
+      <w:r>
+        <w:t xml:space="preserve">conclut que ces variables sociodémographiques, bien que fréquemment étudiées, expliquent finalement peu le comportement, au profit de facteurs contextuels, informationnels et relationnels ; la méta-analyse de</w:t>
+      </w:r>
+      <w:r>
+        <w:t xml:space="preserve"> </w:t>
+      </w:r>
+      <w:r>
+        <w:t xml:space="preserve">Mustapa et Kallas (2025)</w:t>
+      </w:r>
+      <w:r>
+        <w:t xml:space="preserve"> </w:t>
+      </w:r>
+      <w:r>
+        <w:t xml:space="preserve">identifie de son côté des effets hétérogènes du genre, de l’âge, de l’éducation et de la région sur le consentement à payer. Ces approches segmentent donc les individus par leurs</w:t>
+      </w:r>
+      <w:r>
+        <w:t xml:space="preserve"> </w:t>
+      </w:r>
+      <w:r>
+        <w:rPr>
+          <w:b/>
+          <w:bCs/>
+        </w:rPr>
+        <w:t xml:space="preserve">dispositions</w:t>
+      </w:r>
+      <w:r>
+        <w:t xml:space="preserve"> </w:t>
+      </w:r>
+      <w:r>
+        <w:t xml:space="preserve">déclarées.</w:t>
+      </w:r>
+    </w:p>
+    <w:p>
+      <w:pPr>
+        <w:pStyle w:val="BodyText"/>
+      </w:pPr>
+      <w:r>
+        <w:t xml:space="preserve">L’article propose une segmentation d’une autre nature : fondée non sur des attitudes mais sur le</w:t>
+      </w:r>
+      <w:r>
+        <w:t xml:space="preserve"> </w:t>
+      </w:r>
+      <w:r>
+        <w:rPr>
+          <w:b/>
+          <w:bCs/>
+        </w:rPr>
+        <w:t xml:space="preserve">portefeuille de canaux effectivement mobilisé</w:t>
+      </w:r>
+      <w:r>
+        <w:t xml:space="preserve"> </w:t>
+      </w:r>
+      <w:r>
+        <w:t xml:space="preserve">et l’</w:t>
+      </w:r>
+      <w:r>
+        <w:rPr>
+          <w:b/>
+          <w:bCs/>
+        </w:rPr>
+        <w:t xml:space="preserve">allocation réelle de budget</w:t>
+      </w:r>
+      <w:r>
+        <w:t xml:space="preserve"> </w:t>
+      </w:r>
+      <w:r>
+        <w:t xml:space="preserve">qui en résulte. La typologie construite en section 4 classe les ménages selon</w:t>
+      </w:r>
+      <w:r>
+        <w:t xml:space="preserve"> </w:t>
+      </w:r>
+      <w:r>
+        <w:rPr>
+          <w:i/>
+          <w:iCs/>
+        </w:rPr>
+        <w:t xml:space="preserve">ce qu’ils font</w:t>
+      </w:r>
+      <w:r>
+        <w:t xml:space="preserve"> </w:t>
+      </w:r>
+      <w:r>
+        <w:t xml:space="preserve">— la combinaison et l’intensité de fréquentation de treize canaux — plutôt que selon</w:t>
+      </w:r>
+      <w:r>
+        <w:t xml:space="preserve"> </w:t>
+      </w:r>
+      <w:r>
+        <w:rPr>
+          <w:i/>
+          <w:iCs/>
+        </w:rPr>
+        <w:t xml:space="preserve">ce qu’ils déclarent penser</w:t>
+      </w:r>
+      <w:r>
+        <w:t xml:space="preserve">. C’est le troisième déplacement, complémentaire des deux précédents.</w:t>
+      </w:r>
+    </w:p>
+    <w:bookmarkEnd w:id="14"/>
+    <w:bookmarkStart w:id="15" w:name="positionnement-et-hypothèses"/>
+    <w:p>
+      <w:pPr>
+        <w:pStyle w:val="Heading2"/>
+      </w:pPr>
+      <w:r>
+        <w:t xml:space="preserve">2.5 Positionnement et hypothèses</w:t>
+      </w:r>
+    </w:p>
+    <w:p>
+      <w:pPr>
+        <w:pStyle w:val="FirstParagraph"/>
+      </w:pPr>
+      <w:r>
+        <w:rPr>
+          <w:b/>
+          <w:bCs/>
+        </w:rPr>
+        <w:t xml:space="preserve">Tableau 1.</w:t>
+      </w:r>
+      <w:r>
+        <w:t xml:space="preserve"> </w:t>
+      </w:r>
+      <w:r>
+        <w:t xml:space="preserve">Positionnement théorique de l’article.</w:t>
+      </w:r>
+    </w:p>
+    <w:tbl>
+      <w:tblPr>
+        <w:tblStyle w:val="Table"/>
+        <w:tblW w:type="pct" w:w="5000"/>
+        <w:tblLayout w:type="fixed"/>
+        <w:tblLook w:firstRow="1" w:lastRow="0" w:firstColumn="0" w:lastColumn="0" w:noHBand="0" w:noVBand="0" w:val="0020"/>
+      </w:tblPr>
+      <w:tblGrid>
+        <w:gridCol w:w="1516"/>
+        <w:gridCol w:w="2022"/>
+        <w:gridCol w:w="2527"/>
+        <w:gridCol w:w="1853"/>
+      </w:tblGrid>
+      <w:tr>
+        <w:trPr>
+          <w:tblHeader w:val="on"/>
+        </w:trPr>
+        <w:tc>
+          <w:tcPr/>
+          <w:p>
+            <w:pPr>
+              <w:pStyle w:val="Compact"/>
+            </w:pPr>
+            <w:r>
+              <w:t xml:space="preserve">Courant mobilisé</w:t>
+            </w:r>
+          </w:p>
+        </w:tc>
+        <w:tc>
+          <w:tcPr/>
+          <w:p>
+            <w:pPr>
+              <w:pStyle w:val="Compact"/>
+            </w:pPr>
+            <w:r>
+              <w:t xml:space="preserve">Références principales</w:t>
+            </w:r>
+          </w:p>
+        </w:tc>
+        <w:tc>
+          <w:tcPr/>
+          <w:p>
+            <w:pPr>
+              <w:pStyle w:val="Compact"/>
+            </w:pPr>
+            <w:r>
+              <w:t xml:space="preserve">Ce que l’article en retient</w:t>
+            </w:r>
+          </w:p>
+        </w:tc>
+        <w:tc>
+          <w:tcPr/>
+          <w:p>
+            <w:pPr>
+              <w:pStyle w:val="Compact"/>
+            </w:pPr>
+            <w:r>
+              <w:t xml:space="preserve">Déplacement proposé</w:t>
+            </w:r>
+          </w:p>
+        </w:tc>
+      </w:tr>
+      <w:tr>
+        <w:tc>
+          <w:tcPr/>
+          <w:p>
+            <w:pPr>
+              <w:pStyle w:val="Compact"/>
+            </w:pPr>
+            <w:r>
+              <w:t xml:space="preserve">Comportement omnicanal</w:t>
+            </w:r>
+          </w:p>
+        </w:tc>
+        <w:tc>
+          <w:tcPr/>
+          <w:p>
+            <w:pPr>
+              <w:pStyle w:val="Compact"/>
+            </w:pPr>
+            <w:r>
+              <w:t xml:space="preserve">Neslin et al. (2006) ; Verhoef et al. (2015)</w:t>
+            </w:r>
+          </w:p>
+        </w:tc>
+        <w:tc>
+          <w:tcPr/>
+          <w:p>
+            <w:pPr>
+              <w:pStyle w:val="Compact"/>
+            </w:pPr>
+            <w:r>
+              <w:t xml:space="preserve">Le consommateur combine des canaux aux fonctions distinctes</w:t>
+            </w:r>
+          </w:p>
+        </w:tc>
+        <w:tc>
+          <w:tcPr/>
+          <w:p>
+            <w:pPr>
+              <w:pStyle w:val="Compact"/>
+            </w:pPr>
+            <w:r>
+              <w:t xml:space="preserve">Application inédite à l’alimentation locale et directe</w:t>
+            </w:r>
+          </w:p>
+        </w:tc>
+      </w:tr>
+      <w:tr>
+        <w:tc>
+          <w:tcPr/>
+          <w:p>
+            <w:pPr>
+              <w:pStyle w:val="Compact"/>
+            </w:pPr>
+            <w:r>
+              <w:t xml:space="preserve">Consommation alimentaire durable</w:t>
+            </w:r>
+          </w:p>
+        </w:tc>
+        <w:tc>
+          <w:tcPr/>
+          <w:p>
+            <w:pPr>
+              <w:pStyle w:val="Compact"/>
+            </w:pPr>
+            <w:r>
+              <w:t xml:space="preserve">Vermeir &amp; Verbeke (2006) ; Giampietri et al. (2016, 2018) ; Birch et al. (2018)</w:t>
+            </w:r>
+          </w:p>
+        </w:tc>
+        <w:tc>
+          <w:tcPr/>
+          <w:p>
+            <w:pPr>
+              <w:pStyle w:val="Compact"/>
+            </w:pPr>
+            <w:r>
+              <w:t xml:space="preserve">Attitudes favorables mais écart à l’acte (</w:t>
+            </w:r>
+            <w:r>
+              <w:rPr>
+                <w:i/>
+                <w:iCs/>
+              </w:rPr>
+              <w:t xml:space="preserve">attitude-behaviour gap</w:t>
+            </w:r>
+            <w:r>
+              <w:t xml:space="preserve">)</w:t>
+            </w:r>
+          </w:p>
+        </w:tc>
+        <w:tc>
+          <w:tcPr/>
+          <w:p>
+            <w:pPr>
+              <w:pStyle w:val="Compact"/>
+            </w:pPr>
+            <w:r>
+              <w:t xml:space="preserve">Du déclaratif à l’</w:t>
+            </w:r>
+            <w:r>
+              <w:rPr>
+                <w:b/>
+                <w:bCs/>
+              </w:rPr>
+              <w:t xml:space="preserve">allocation budgétaire réelle</w:t>
+            </w:r>
+          </w:p>
+        </w:tc>
+      </w:tr>
+      <w:tr>
+        <w:tc>
+          <w:tcPr/>
+          <w:p>
+            <w:pPr>
+              <w:pStyle w:val="Compact"/>
+            </w:pPr>
+            <w:r>
+              <w:t xml:space="preserve">Segmentation du consommateur</w:t>
+            </w:r>
+          </w:p>
+        </w:tc>
+        <w:tc>
+          <w:tcPr/>
+          <w:p>
+            <w:pPr>
+              <w:pStyle w:val="Compact"/>
+            </w:pPr>
+            <w:r>
+              <w:t xml:space="preserve">Feldmann &amp; Hamm (2015) ; Herzig &amp; Zander (2025) ; Mustapa &amp; Kallas (2025)</w:t>
+            </w:r>
+          </w:p>
+        </w:tc>
+        <w:tc>
+          <w:tcPr/>
+          <w:p>
+            <w:pPr>
+              <w:pStyle w:val="Compact"/>
+            </w:pPr>
+            <w:r>
+              <w:t xml:space="preserve">Profils fondés sur attitudes, motivations, consentement à payer</w:t>
+            </w:r>
+          </w:p>
+        </w:tc>
+        <w:tc>
+          <w:tcPr/>
+          <w:p>
+            <w:pPr>
+              <w:pStyle w:val="Compact"/>
+            </w:pPr>
+            <w:r>
+              <w:t xml:space="preserve">Segmentation par le</w:t>
+            </w:r>
+            <w:r>
+              <w:t xml:space="preserve"> </w:t>
+            </w:r>
+            <w:r>
+              <w:rPr>
+                <w:b/>
+                <w:bCs/>
+              </w:rPr>
+              <w:t xml:space="preserve">portefeuille de canaux</w:t>
+            </w:r>
+            <w:r>
+              <w:t xml:space="preserve"> </w:t>
+            </w:r>
+            <w:r>
+              <w:t xml:space="preserve">et le budget réel</w:t>
+            </w:r>
+          </w:p>
+        </w:tc>
+      </w:tr>
+      <w:tr>
+        <w:tc>
+          <w:tcPr/>
+          <w:p>
+            <w:pPr>
+              <w:pStyle w:val="Compact"/>
+            </w:pPr>
+            <w:r>
+              <w:t xml:space="preserve">Circuits courts (UE / France)</w:t>
+            </w:r>
+          </w:p>
+        </w:tc>
+        <w:tc>
+          <w:tcPr/>
+          <w:p>
+            <w:pPr>
+              <w:pStyle w:val="Compact"/>
+            </w:pPr>
+            <w:r>
+              <w:t xml:space="preserve">Kneafsey et al. (2013) ; Chiffoleau (2019, 2020) ; Praly et al. (2014)</w:t>
+            </w:r>
+          </w:p>
+        </w:tc>
+        <w:tc>
+          <w:tcPr/>
+          <w:p>
+            <w:pPr>
+              <w:pStyle w:val="Compact"/>
+            </w:pPr>
+            <w:r>
+              <w:t xml:space="preserve">État socio-économique et formes d’organisation</w:t>
+            </w:r>
+          </w:p>
+        </w:tc>
+        <w:tc>
+          <w:tcPr/>
+          <w:p>
+            <w:pPr>
+              <w:pStyle w:val="Compact"/>
+            </w:pPr>
+            <w:r>
+              <w:t xml:space="preserve">Mesure représentative nationale actualisée,</w:t>
+            </w:r>
+            <w:r>
+              <w:t xml:space="preserve"> </w:t>
+            </w:r>
+            <w:r>
+              <w:rPr>
+                <w:b/>
+                <w:bCs/>
+              </w:rPr>
+              <w:t xml:space="preserve">côté ménage</w:t>
+            </w:r>
+          </w:p>
+        </w:tc>
+      </w:tr>
+    </w:tbl>
+    <w:p>
+      <w:pPr>
+        <w:pStyle w:val="BodyText"/>
+      </w:pPr>
+      <w:r>
+        <w:t xml:space="preserve">De ce positionnement découlent trois hypothèses, que l’analyse empirique met à l’épreuve.</w:t>
       </w:r>
     </w:p>
     <w:p>
@@ -884,9 +1760,40 @@
         <w:t xml:space="preserve">par le profil sociodémographique : elle traverse les catégories plutôt qu’elle ne distingue un groupe social.</w:t>
       </w:r>
     </w:p>
-    <w:bookmarkEnd w:id="13"/>
-    <w:bookmarkEnd w:id="14"/>
-    <w:bookmarkStart w:id="18" w:name="méthode"/>
+    <w:p>
+      <w:pPr>
+        <w:numPr>
+          <w:ilvl w:val="0"/>
+          <w:numId w:val="1001"/>
+        </w:numPr>
+      </w:pPr>
+      <w:r>
+        <w:rPr>
+          <w:b/>
+          <w:bCs/>
+        </w:rPr>
+        <w:t xml:space="preserve">H3 — Écart intention/budget.</w:t>
+      </w:r>
+      <w:r>
+        <w:t xml:space="preserve"> </w:t>
+      </w:r>
+      <w:r>
+        <w:t xml:space="preserve">Conformément à l’</w:t>
+      </w:r>
+      <w:r>
+        <w:rPr>
+          <w:i/>
+          <w:iCs/>
+        </w:rPr>
+        <w:t xml:space="preserve">attitude-behaviour gap</w:t>
+      </w:r>
+      <w:r>
+        <w:t xml:space="preserve">, l’adhésion déclarée à la vente directe (motivations, diffusion) est nettement plus forte que son poids dans le budget effectif : beaucoup l’essaient, peu l’installent.</w:t>
+      </w:r>
+    </w:p>
+    <w:bookmarkEnd w:id="15"/>
+    <w:bookmarkEnd w:id="16"/>
+    <w:bookmarkStart w:id="20" w:name="méthode"/>
     <w:p>
       <w:pPr>
         <w:pStyle w:val="Heading1"/>
@@ -895,7 +1802,7 @@
         <w:t xml:space="preserve">3. Méthode</w:t>
       </w:r>
     </w:p>
-    <w:bookmarkStart w:id="15" w:name="données-et-échantillon"/>
+    <w:bookmarkStart w:id="17" w:name="données-et-échantillon"/>
     <w:p>
       <w:pPr>
         <w:pStyle w:val="Heading2"/>
@@ -933,8 +1840,8 @@
         <w:t xml:space="preserve">La qualité des données est élevée : les variables clés (sexe, âge, CSP, budget, fréquentation des canaux) ne présentent aucune valeur manquante, et les parts de budget déclarées par canal somment exactement à 100 % pour l’ensemble des répondants, ce qui atteste de la cohérence du protocole de recueil.</w:t>
       </w:r>
     </w:p>
-    <w:bookmarkEnd w:id="15"/>
-    <w:bookmarkStart w:id="16" w:name="variables"/>
+    <w:bookmarkEnd w:id="17"/>
+    <w:bookmarkStart w:id="18" w:name="variables"/>
     <w:p>
       <w:pPr>
         <w:pStyle w:val="Heading2"/>
@@ -958,7 +1865,7 @@
         <w:t xml:space="preserve"> </w:t>
       </w:r>
       <w:r>
-        <w:t xml:space="preserve">Pour chacun des treize canaux ou modalités d’achat (tableau 1), le répondant a indiqué sa fréquence d’achat sur une échelle ordinale en sept positions, de « plusieurs fois par semaine » à « jamais ». Nous en dérivons deux indicateurs : la</w:t>
+        <w:t xml:space="preserve">Pour chacun des treize canaux ou modalités d’achat (tableau 2), le répondant a indiqué sa fréquence d’achat sur une échelle ordinale en sept positions, de « plusieurs fois par semaine » à « jamais ». Nous en dérivons deux indicateurs : la</w:t>
       </w:r>
       <w:r>
         <w:t xml:space="preserve"> </w:t>
@@ -1057,8 +1964,8 @@
         <w:t xml:space="preserve">Sexe, âge (six tranches), catégorie socioprofessionnelle (six postes recodés), budget alimentaire mensuel, et indicateurs géographiques (région, taille d’unité urbaine).</w:t>
       </w:r>
     </w:p>
-    <w:bookmarkEnd w:id="16"/>
-    <w:bookmarkStart w:id="17" w:name="analyses"/>
+    <w:bookmarkEnd w:id="18"/>
+    <w:bookmarkStart w:id="19" w:name="analyses"/>
     <w:p>
       <w:pPr>
         <w:pStyle w:val="Heading2"/>
@@ -1245,9 +2152,9 @@
         <w:t xml:space="preserve">) et est intégralement reproductible à partir des scripts versionnés.</w:t>
       </w:r>
     </w:p>
-    <w:bookmarkEnd w:id="17"/>
-    <w:bookmarkEnd w:id="18"/>
-    <w:bookmarkStart w:id="40" w:name="résultats"/>
+    <w:bookmarkEnd w:id="19"/>
+    <w:bookmarkEnd w:id="20"/>
+    <w:bookmarkStart w:id="42" w:name="résultats"/>
     <w:p>
       <w:pPr>
         <w:pStyle w:val="Heading1"/>
@@ -1256,7 +2163,7 @@
         <w:t xml:space="preserve">4. Résultats</w:t>
       </w:r>
     </w:p>
-    <w:bookmarkStart w:id="22" w:name="le-portefeuille-de-canaux-des-ménages"/>
+    <w:bookmarkStart w:id="24" w:name="le-portefeuille-de-canaux-des-ménages"/>
     <w:p>
       <w:pPr>
         <w:pStyle w:val="Heading2"/>
@@ -1286,7 +2193,7 @@
         <w:t xml:space="preserve"> </w:t>
       </w:r>
       <w:r>
-        <w:t xml:space="preserve">d’approvisionnement différents. Le tableau 1 et la figure 1 en révèlent la hiérarchie. L’</w:t>
+        <w:t xml:space="preserve">d’approvisionnement différents. Le tableau 2 et la figure 1 en révèlent la hiérarchie. L’</w:t>
       </w:r>
       <w:r>
         <w:rPr>
@@ -1375,7 +2282,7 @@
           <w:b/>
           <w:bCs/>
         </w:rPr>
-        <w:t xml:space="preserve">Tableau 1.</w:t>
+        <w:t xml:space="preserve">Tableau 2.</w:t>
       </w:r>
       <w:r>
         <w:t xml:space="preserve"> </w:t>
@@ -2225,18 +3132,18 @@
           <wp:inline>
             <wp:extent cx="5334000" cy="3192232"/>
             <wp:effectExtent b="0" l="0" r="0" t="0"/>
-            <wp:docPr descr="Figure 1" title="" id="20" name="Picture"/>
+            <wp:docPr descr="Figure 1" title="" id="22" name="Picture"/>
             <a:graphic>
               <a:graphicData uri="http://schemas.openxmlformats.org/drawingml/2006/picture">
                 <pic:pic>
                   <pic:nvPicPr>
-                    <pic:cNvPr descr="/home/user/formation-Claude/figures/png/fig1_part_budget_canal.png" id="21" name="Picture"/>
+                    <pic:cNvPr descr="/home/user/formation-Claude/figures/png/fig1_part_budget_canal.png" id="23" name="Picture"/>
                     <pic:cNvPicPr>
                       <a:picLocks noChangeArrowheads="1" noChangeAspect="1"/>
                     </pic:cNvPicPr>
                   </pic:nvPicPr>
                   <pic:blipFill>
-                    <a:blip r:embed="rId19"/>
+                    <a:blip r:embed="rId21"/>
                     <a:stretch>
                       <a:fillRect/>
                     </a:stretch>
@@ -2313,8 +3220,8 @@
         <w:t xml:space="preserve">: un noyau dominé par la grande distribution et le discount, qui concentre près des trois quarts du budget, et une périphérie de canaux spécialisés — dont la vente directe — fréquentés par beaucoup mais pour de faibles montants.</w:t>
       </w:r>
     </w:p>
-    <w:bookmarkEnd w:id="22"/>
-    <w:bookmarkStart w:id="26" w:name="Xb8ac569a55e6c93b3e034fbafe08cee9a96946e"/>
+    <w:bookmarkEnd w:id="24"/>
+    <w:bookmarkStart w:id="28" w:name="Xb8ac569a55e6c93b3e034fbafe08cee9a96946e"/>
     <w:p>
       <w:pPr>
         <w:pStyle w:val="Heading2"/>
@@ -2344,7 +3251,7 @@
         <w:t xml:space="preserve"> </w:t>
       </w:r>
       <w:r>
-        <w:t xml:space="preserve">(666 sur 1 025) pratiquent une forme de vente directe (tableau 2). Cette proportion, élevée, masque toutefois une réalité contrastée. Prise canal par canal, l’achat direct aux agriculteurs (canal 7) concerne 49,7 % des ménages, mais seulement 17,3 % de façon régulière (au moins mensuelle ; figure 2). L’apport de la seconde porte — l’achat direct au producteur sur les marchés — est substantiel : elle ajoute</w:t>
+        <w:t xml:space="preserve">(666 sur 1 025) pratiquent une forme de vente directe (tableau 3). Cette proportion, élevée, masque toutefois une réalité contrastée. Prise canal par canal, l’achat direct aux agriculteurs (canal 7) concerne 49,7 % des ménages, mais seulement 17,3 % de façon régulière (au moins mensuelle ; figure 2). L’apport de la seconde porte — l’achat direct au producteur sur les marchés — est substantiel : elle ajoute</w:t>
       </w:r>
       <w:r>
         <w:t xml:space="preserve"> </w:t>
@@ -2372,7 +3279,7 @@
           <w:b/>
           <w:bCs/>
         </w:rPr>
-        <w:t xml:space="preserve">Tableau 2.</w:t>
+        <w:t xml:space="preserve">Tableau 3.</w:t>
       </w:r>
       <w:r>
         <w:t xml:space="preserve"> </w:t>
@@ -2592,18 +3499,18 @@
           <wp:inline>
             <wp:extent cx="5334000" cy="3594277"/>
             <wp:effectExtent b="0" l="0" r="0" t="0"/>
-            <wp:docPr descr="Figure 2" title="" id="24" name="Picture"/>
+            <wp:docPr descr="Figure 2" title="" id="26" name="Picture"/>
             <a:graphic>
               <a:graphicData uri="http://schemas.openxmlformats.org/drawingml/2006/picture">
                 <pic:pic>
                   <pic:nvPicPr>
-                    <pic:cNvPr descr="/home/user/formation-Claude/figures/png/fig2_frequence_canal7.png" id="25" name="Picture"/>
+                    <pic:cNvPr descr="/home/user/formation-Claude/figures/png/fig2_frequence_canal7.png" id="27" name="Picture"/>
                     <pic:cNvPicPr>
                       <a:picLocks noChangeArrowheads="1" noChangeAspect="1"/>
                     </pic:cNvPicPr>
                   </pic:nvPicPr>
                   <pic:blipFill>
-                    <a:blip r:embed="rId23"/>
+                    <a:blip r:embed="rId25"/>
                     <a:stretch>
                       <a:fillRect/>
                     </a:stretch>
@@ -2706,31 +3613,41 @@
         <w:t xml:space="preserve">complément ciblé</w:t>
       </w:r>
       <w:r>
-        <w:t xml:space="preserve">, mobilisé occasionnellement et pour une fraction réduite des dépenses. La vente directe est, en somme,</w:t>
-      </w:r>
-      <w:r>
-        <w:t xml:space="preserve"> </w:t>
-      </w:r>
-      <w:r>
-        <w:rPr>
-          <w:b/>
-          <w:bCs/>
-        </w:rPr>
-        <w:t xml:space="preserve">largement essayée mais rarement intensive</w:t>
-      </w:r>
-      <w:r>
-        <w:t xml:space="preserve">.</w:t>
-      </w:r>
-    </w:p>
-    <w:p>
-      <w:pPr>
-        <w:pStyle w:val="BlockText"/>
-      </w:pPr>
+        <w:t xml:space="preserve">, mobilisé occasionnellement et pour une fraction réduite des dépenses. Il valide aussi H3 : l’adhésion déclarée (65 % de pratiquants) contraste fortement avec le poids budgétaire réel (~1,5 %) — une manifestation directe de l’</w:t>
+      </w:r>
       <w:r>
         <w:rPr>
           <w:i/>
           <w:iCs/>
         </w:rPr>
+        <w:t xml:space="preserve">attitude-behaviour gap</w:t>
+      </w:r>
+      <w:r>
+        <w:t xml:space="preserve">. La vente directe est, en somme,</w:t>
+      </w:r>
+      <w:r>
+        <w:t xml:space="preserve"> </w:t>
+      </w:r>
+      <w:r>
+        <w:rPr>
+          <w:b/>
+          <w:bCs/>
+        </w:rPr>
+        <w:t xml:space="preserve">largement essayée mais rarement intensive</w:t>
+      </w:r>
+      <w:r>
+        <w:t xml:space="preserve">.</w:t>
+      </w:r>
+    </w:p>
+    <w:p>
+      <w:pPr>
+        <w:pStyle w:val="BlockText"/>
+      </w:pPr>
+      <w:r>
+        <w:rPr>
+          <w:i/>
+          <w:iCs/>
+        </w:rPr>
         <w:t xml:space="preserve">Caveat de mesure.</w:t>
       </w:r>
       <w:r>
@@ -2756,8 +3673,8 @@
         <w:t xml:space="preserve">le poids budgétaire total de la vente directe. L’ordre de grandeur — marginal — n’en est pas affecté.</w:t>
       </w:r>
     </w:p>
-    <w:bookmarkEnd w:id="26"/>
-    <w:bookmarkStart w:id="30" w:name="cinq-stratégies-dapprovisionnement"/>
+    <w:bookmarkEnd w:id="28"/>
+    <w:bookmarkStart w:id="32" w:name="cinq-stratégies-dapprovisionnement"/>
     <w:p>
       <w:pPr>
         <w:pStyle w:val="Heading2"/>
@@ -2787,7 +3704,7 @@
         <w:t xml:space="preserve"> </w:t>
       </w:r>
       <w:r>
-        <w:t xml:space="preserve">distinctes (figure 3), que l’examen conjoint de la pénétration et de l’usage régulier des canaux permet de caractériser (tableau 3). Nous les présentons par effectif décroissant.</w:t>
+        <w:t xml:space="preserve">distinctes (figure 3), que l’examen conjoint de la pénétration et de l’usage régulier des canaux permet de caractériser (tableau 4). Nous les présentons par effectif décroissant.</w:t>
       </w:r>
     </w:p>
     <w:p>
@@ -2799,7 +3716,7 @@
           <w:b/>
           <w:bCs/>
         </w:rPr>
-        <w:t xml:space="preserve">Tableau 3.</w:t>
+        <w:t xml:space="preserve">Tableau 4.</w:t>
       </w:r>
       <w:r>
         <w:t xml:space="preserve"> </w:t>
@@ -3441,18 +4358,18 @@
           <wp:inline>
             <wp:extent cx="5334000" cy="4654817"/>
             <wp:effectExtent b="0" l="0" r="0" t="0"/>
-            <wp:docPr descr="Figure 3" title="" id="28" name="Picture"/>
+            <wp:docPr descr="Figure 3" title="" id="30" name="Picture"/>
             <a:graphic>
               <a:graphicData uri="http://schemas.openxmlformats.org/drawingml/2006/picture">
                 <pic:pic>
                   <pic:nvPicPr>
-                    <pic:cNvPr descr="/home/user/formation-Claude/figures/png/fig3_plan_factoriel.png" id="29" name="Picture"/>
+                    <pic:cNvPr descr="/home/user/formation-Claude/figures/png/fig3_plan_factoriel.png" id="31" name="Picture"/>
                     <pic:cNvPicPr>
                       <a:picLocks noChangeArrowheads="1" noChangeAspect="1"/>
                     </pic:cNvPicPr>
                   </pic:nvPicPr>
                   <pic:blipFill>
-                    <a:blip r:embed="rId27"/>
+                    <a:blip r:embed="rId29"/>
                     <a:stretch>
                       <a:fillRect/>
                     </a:stretch>
@@ -3766,8 +4683,8 @@
         <w:t xml:space="preserve">existe, et qu’il n’est pas le fait des ménages les plus aisés.</w:t>
       </w:r>
     </w:p>
-    <w:bookmarkEnd w:id="30"/>
-    <w:bookmarkStart w:id="31" w:name="X03a121fbb803a03a8cc5103aaa35fa14b53e1fb"/>
+    <w:bookmarkEnd w:id="32"/>
+    <w:bookmarkStart w:id="33" w:name="X03a121fbb803a03a8cc5103aaa35fa14b53e1fb"/>
     <w:p>
       <w:pPr>
         <w:pStyle w:val="Heading2"/>
@@ -3816,8 +4733,8 @@
         <w:t xml:space="preserve">culmine chez les seuls omnivores engagés (C3, 67 %), soulignant que largeur du répertoire et intensité d’engagement ne se confondent pas.</w:t>
       </w:r>
     </w:p>
-    <w:bookmarkEnd w:id="31"/>
-    <w:bookmarkStart w:id="35" w:name="des-déterminants-sociaux-ténus"/>
+    <w:bookmarkEnd w:id="33"/>
+    <w:bookmarkStart w:id="37" w:name="des-déterminants-sociaux-ténus"/>
     <w:p>
       <w:pPr>
         <w:pStyle w:val="Heading2"/>
@@ -3831,7 +4748,7 @@
         <w:pStyle w:val="FirstParagraph"/>
       </w:pPr>
       <w:r>
-        <w:t xml:space="preserve">La régression logistique (tableau 4, figure 4) confirme et nuance ce constat. Le modèle explique</w:t>
+        <w:t xml:space="preserve">La régression logistique (tableau 5, figure 4) confirme et nuance ce constat. Le modèle explique</w:t>
       </w:r>
       <w:r>
         <w:t xml:space="preserve"> </w:t>
@@ -3891,7 +4808,7 @@
           <w:b/>
           <w:bCs/>
         </w:rPr>
-        <w:t xml:space="preserve">Tableau 4.</w:t>
+        <w:t xml:space="preserve">Tableau 5.</w:t>
       </w:r>
       <w:r>
         <w:t xml:space="preserve"> </w:t>
@@ -4201,18 +5118,18 @@
           <wp:inline>
             <wp:extent cx="5334000" cy="3815982"/>
             <wp:effectExtent b="0" l="0" r="0" t="0"/>
-            <wp:docPr descr="Figure 4" title="" id="33" name="Picture"/>
+            <wp:docPr descr="Figure 4" title="" id="35" name="Picture"/>
             <a:graphic>
               <a:graphicData uri="http://schemas.openxmlformats.org/drawingml/2006/picture">
                 <pic:pic>
                   <pic:nvPicPr>
-                    <pic:cNvPr descr="/home/user/formation-Claude/figures/png/fig4_regression_or.png" id="34" name="Picture"/>
+                    <pic:cNvPr descr="/home/user/formation-Claude/figures/png/fig4_regression_or.png" id="36" name="Picture"/>
                     <pic:cNvPicPr>
                       <a:picLocks noChangeArrowheads="1" noChangeAspect="1"/>
                     </pic:cNvPicPr>
                   </pic:nvPicPr>
                   <pic:blipFill>
-                    <a:blip r:embed="rId32"/>
+                    <a:blip r:embed="rId34"/>
                     <a:stretch>
                       <a:fillRect/>
                     </a:stretch>
@@ -4311,8 +5228,8 @@
         <w:t xml:space="preserve">, pour qui les variables sociodémographiques, bien que fréquemment étudiées, expliquent finalement peu le comportement d’achat en circuit court, au profit de facteurs contextuels et relationnels.</w:t>
       </w:r>
     </w:p>
-    <w:bookmarkEnd w:id="35"/>
-    <w:bookmarkStart w:id="39" w:name="des-motivations-ancrées-dans-le-local"/>
+    <w:bookmarkEnd w:id="37"/>
+    <w:bookmarkStart w:id="41" w:name="des-motivations-ancrées-dans-le-local"/>
     <w:p>
       <w:pPr>
         <w:pStyle w:val="Heading2"/>
@@ -4418,18 +5335,18 @@
           <wp:inline>
             <wp:extent cx="5334000" cy="2856558"/>
             <wp:effectExtent b="0" l="0" r="0" t="0"/>
-            <wp:docPr descr="Figure 5" title="" id="37" name="Picture"/>
+            <wp:docPr descr="Figure 5" title="" id="39" name="Picture"/>
             <a:graphic>
               <a:graphicData uri="http://schemas.openxmlformats.org/drawingml/2006/picture">
                 <pic:pic>
                   <pic:nvPicPr>
-                    <pic:cNvPr descr="/home/user/formation-Claude/figures/png/fig5_motivations_marche.png" id="38" name="Picture"/>
+                    <pic:cNvPr descr="/home/user/formation-Claude/figures/png/fig5_motivations_marche.png" id="40" name="Picture"/>
                     <pic:cNvPicPr>
                       <a:picLocks noChangeArrowheads="1" noChangeAspect="1"/>
                     </pic:cNvPicPr>
                   </pic:nvPicPr>
                   <pic:blipFill>
-                    <a:blip r:embed="rId36"/>
+                    <a:blip r:embed="rId38"/>
                     <a:stretch>
                       <a:fillRect/>
                     </a:stretch>
@@ -4482,9 +5399,9 @@
         <w:t xml:space="preserve">Principales motivations d’achat sur les marchés (classement top 3).</w:t>
       </w:r>
     </w:p>
-    <w:bookmarkEnd w:id="39"/>
-    <w:bookmarkEnd w:id="40"/>
-    <w:bookmarkStart w:id="45" w:name="discussion"/>
+    <w:bookmarkEnd w:id="41"/>
+    <w:bookmarkEnd w:id="42"/>
+    <w:bookmarkStart w:id="47" w:name="discussion"/>
     <w:p>
       <w:pPr>
         <w:pStyle w:val="Heading1"/>
@@ -4493,7 +5410,7 @@
         <w:t xml:space="preserve">5. Discussion</w:t>
       </w:r>
     </w:p>
-    <w:bookmarkStart w:id="41" w:name="la-vente-directe-comme-complément-diffus"/>
+    <w:bookmarkStart w:id="43" w:name="la-vente-directe-comme-complément-diffus"/>
     <w:p>
       <w:pPr>
         <w:pStyle w:val="Heading2"/>
@@ -4564,7 +5481,38 @@
         <w:t xml:space="preserve">(Goodman et DuPuis 2002; Sage 2003)</w:t>
       </w:r>
       <w:r>
-        <w:t xml:space="preserve">, mais il la quantifie précisément du point de vue du consommateur. Il fait également écho aux travaux récents qui, après l’espoir suscité par la crise sanitaire de voir les circuits courts monter en puissance, constatent une</w:t>
+        <w:t xml:space="preserve">, mais il la quantifie précisément du point de vue du consommateur. Il donne surtout une mesure inédite de l’</w:t>
+      </w:r>
+      <w:r>
+        <w:rPr>
+          <w:i/>
+          <w:iCs/>
+        </w:rPr>
+        <w:t xml:space="preserve">attitude-behaviour gap</w:t>
+      </w:r>
+      <w:r>
+        <w:t xml:space="preserve"> </w:t>
+      </w:r>
+      <w:r>
+        <w:t xml:space="preserve">(Vermeir et Verbeke 2006)</w:t>
+      </w:r>
+      <w:r>
+        <w:t xml:space="preserve"> </w:t>
+      </w:r>
+      <w:r>
+        <w:t xml:space="preserve">: alors que la méta-analyse de</w:t>
+      </w:r>
+      <w:r>
+        <w:t xml:space="preserve"> </w:t>
+      </w:r>
+      <w:r>
+        <w:t xml:space="preserve">Mustapa et Kallas (2025)</w:t>
+      </w:r>
+      <w:r>
+        <w:t xml:space="preserve"> </w:t>
+      </w:r>
+      <w:r>
+        <w:t xml:space="preserve">chiffre à +34,5 % la prime que les consommateurs se déclarent prêts à payer pour un produit de circuit court, la part de budget réellement consacrée à la vente directe reste marginale. L’écart entre l’intention affichée et l’allocation effective n’est pas anecdotique — il est au cœur du phénomène. Il fait également écho aux travaux récents qui, après l’espoir suscité par la crise sanitaire de voir les circuits courts monter en puissance, constatent une</w:t>
       </w:r>
       <w:r>
         <w:t xml:space="preserve"> </w:t>
@@ -4592,8 +5540,8 @@
         <w:t xml:space="preserve">.</w:t>
       </w:r>
     </w:p>
-    <w:bookmarkEnd w:id="41"/>
-    <w:bookmarkStart w:id="42" w:name="Xb1927cd501916c0e629b238992db577b94962c6"/>
+    <w:bookmarkEnd w:id="43"/>
+    <w:bookmarkStart w:id="44" w:name="Xb1927cd501916c0e629b238992db577b94962c6"/>
     <w:p>
       <w:pPr>
         <w:pStyle w:val="Heading2"/>
@@ -4642,8 +5590,8 @@
         <w:t xml:space="preserve">(accessibilité, temps, régularité de l’offre) plutôt que de cibler une catégorie supposée acquise.</w:t>
       </w:r>
     </w:p>
-    <w:bookmarkEnd w:id="42"/>
-    <w:bookmarkStart w:id="43" w:name="X42bddffd3b8151c2ab10e23a331c071586deea7"/>
+    <w:bookmarkEnd w:id="44"/>
+    <w:bookmarkStart w:id="45" w:name="X42bddffd3b8151c2ab10e23a331c071586deea7"/>
     <w:p>
       <w:pPr>
         <w:pStyle w:val="Heading2"/>
@@ -4750,8 +5698,8 @@
         <w:t xml:space="preserve">— que révèle l’écart entre vente directe inclusive et régulière — apparaît ainsi comme un ressort central de ces configurations, et une variable-clé pour qui veut faire passer la vente directe du répertoire d’appoint au socle de l’approvisionnement. Cette grille pourrait être réinvestie pour d’autres canaux alternatifs (bio, vrac, anti-gaspillage) et pour suivre, dans le temps, les recompositions des répertoires d’achat.</w:t>
       </w:r>
     </w:p>
-    <w:bookmarkEnd w:id="43"/>
-    <w:bookmarkStart w:id="44" w:name="limites"/>
+    <w:bookmarkEnd w:id="45"/>
+    <w:bookmarkStart w:id="46" w:name="limites"/>
     <w:p>
       <w:pPr>
         <w:pStyle w:val="Heading2"/>
@@ -4816,9 +5764,9 @@
         <w:t xml:space="preserve">déjà signalé — l’impossibilité d’isoler la part directe des achats sur les marchés — conduit à sous-estimer le poids total de la vente directe. Enfin, la plus petite classe (hors-hypermarché, n = 26) appelle la prudence dans l’interprétation de ses caractéristiques fines, et les motivations n’ont été analysées que pour le canal des marchés.</w:t>
       </w:r>
     </w:p>
-    <w:bookmarkEnd w:id="44"/>
-    <w:bookmarkEnd w:id="45"/>
-    <w:bookmarkStart w:id="46" w:name="conclusion"/>
+    <w:bookmarkEnd w:id="46"/>
+    <w:bookmarkEnd w:id="47"/>
+    <w:bookmarkStart w:id="48" w:name="conclusion"/>
     <w:p>
       <w:pPr>
         <w:pStyle w:val="Heading1"/>
@@ -4919,8 +5867,8 @@
         </w:pict>
       </w:r>
     </w:p>
-    <w:bookmarkEnd w:id="46"/>
-    <w:bookmarkStart w:id="64" w:name="références"/>
+    <w:bookmarkEnd w:id="48"/>
+    <w:bookmarkStart w:id="82" w:name="références"/>
     <w:p>
       <w:pPr>
         <w:pStyle w:val="Heading1"/>
@@ -4929,14 +5877,23 @@
         <w:t xml:space="preserve">Références</w:t>
       </w:r>
     </w:p>
-    <w:bookmarkStart w:id="63" w:name="refs"/>
-    <w:bookmarkStart w:id="47" w:name="ref-chiffoleau2019"/>
+    <w:bookmarkStart w:id="81" w:name="refs"/>
+    <w:bookmarkStart w:id="50" w:name="ref-birch2018"/>
     <w:p>
       <w:pPr>
         <w:pStyle w:val="Bibliography"/>
       </w:pPr>
       <w:r>
-        <w:t xml:space="preserve">Chiffoleau, Yuna. 2019.</w:t>
+        <w:t xml:space="preserve">Birch, Dawn, Juliet Memery, et Maheshan De Silva Kanakaratne. 2018.</w:t>
+      </w:r>
+      <w:r>
+        <w:t xml:space="preserve"> </w:t>
+      </w:r>
+      <w:r>
+        <w:t xml:space="preserve">« The mindful consumer: Balancing egoistic and altruistic motivations to purchase local food »</w:t>
+      </w:r>
+      <w:r>
+        <w:t xml:space="preserve">.</w:t>
       </w:r>
       <w:r>
         <w:t xml:space="preserve"> </w:t>
@@ -4946,41 +5903,37 @@
           <w:i/>
           <w:iCs/>
         </w:rPr>
-        <w:t xml:space="preserve">Les circuits courts alimentaires : entre marché et innovation sociale</w:t>
-      </w:r>
-      <w:r>
-        <w:t xml:space="preserve">. Érès.</w:t>
-      </w:r>
-    </w:p>
-    <w:bookmarkEnd w:id="47"/>
-    <w:bookmarkStart w:id="49" w:name="ref-chiffoleau2020"/>
+        <w:t xml:space="preserve">Journal of Retailing and Consumer Services</w:t>
+      </w:r>
+      <w:r>
+        <w:t xml:space="preserve"> </w:t>
+      </w:r>
+      <w:r>
+        <w:t xml:space="preserve">40: 221‑28.</w:t>
+      </w:r>
+      <w:r>
+        <w:t xml:space="preserve"> </w:t>
+      </w:r>
+      <w:hyperlink r:id="rId49">
+        <w:r>
+          <w:rPr>
+            <w:rStyle w:val="Hyperlink"/>
+          </w:rPr>
+          <w:t xml:space="preserve">https://doi.org/10.1016/j.jretconser.2017.10.013</w:t>
+        </w:r>
+      </w:hyperlink>
+      <w:r>
+        <w:t xml:space="preserve">.</w:t>
+      </w:r>
+    </w:p>
+    <w:bookmarkEnd w:id="50"/>
+    <w:bookmarkStart w:id="51" w:name="ref-chiffoleau2019"/>
     <w:p>
       <w:pPr>
         <w:pStyle w:val="Bibliography"/>
       </w:pPr>
       <w:r>
-        <w:t xml:space="preserve">Chiffoleau, Yuna, et Tara Dourian. 2020.</w:t>
-      </w:r>
-      <w:r>
-        <w:t xml:space="preserve"> </w:t>
-      </w:r>
-      <w:r>
-        <w:t xml:space="preserve">« Sustainable food supply chains: Is shortening the answer?</w:t>
-      </w:r>
-      <w:r>
-        <w:t xml:space="preserve"> </w:t>
-      </w:r>
-      <w:r>
-        <w:t xml:space="preserve">A</w:t>
-      </w:r>
-      <w:r>
-        <w:t xml:space="preserve"> </w:t>
-      </w:r>
-      <w:r>
-        <w:t xml:space="preserve">literature review for a research and innovation agenda »</w:t>
-      </w:r>
-      <w:r>
-        <w:t xml:space="preserve">.</w:t>
+        <w:t xml:space="preserve">Chiffoleau, Yuna. 2019.</w:t>
       </w:r>
       <w:r>
         <w:t xml:space="preserve"> </w:t>
@@ -4990,6 +5943,50 @@
           <w:i/>
           <w:iCs/>
         </w:rPr>
+        <w:t xml:space="preserve">Les circuits courts alimentaires : entre marché et innovation sociale</w:t>
+      </w:r>
+      <w:r>
+        <w:t xml:space="preserve">. Érès.</w:t>
+      </w:r>
+    </w:p>
+    <w:bookmarkEnd w:id="51"/>
+    <w:bookmarkStart w:id="53" w:name="ref-chiffoleau2020"/>
+    <w:p>
+      <w:pPr>
+        <w:pStyle w:val="Bibliography"/>
+      </w:pPr>
+      <w:r>
+        <w:t xml:space="preserve">Chiffoleau, Yuna, et Tara Dourian. 2020.</w:t>
+      </w:r>
+      <w:r>
+        <w:t xml:space="preserve"> </w:t>
+      </w:r>
+      <w:r>
+        <w:t xml:space="preserve">« Sustainable food supply chains: Is shortening the answer?</w:t>
+      </w:r>
+      <w:r>
+        <w:t xml:space="preserve"> </w:t>
+      </w:r>
+      <w:r>
+        <w:t xml:space="preserve">A</w:t>
+      </w:r>
+      <w:r>
+        <w:t xml:space="preserve"> </w:t>
+      </w:r>
+      <w:r>
+        <w:t xml:space="preserve">literature review for a research and innovation agenda »</w:t>
+      </w:r>
+      <w:r>
+        <w:t xml:space="preserve">.</w:t>
+      </w:r>
+      <w:r>
+        <w:t xml:space="preserve"> </w:t>
+      </w:r>
+      <w:r>
+        <w:rPr>
+          <w:i/>
+          <w:iCs/>
+        </w:rPr>
         <w:t xml:space="preserve">Sustainability</w:t>
       </w:r>
       <w:r>
@@ -5001,7 +5998,7 @@
       <w:r>
         <w:t xml:space="preserve"> </w:t>
       </w:r>
-      <w:hyperlink r:id="rId48">
+      <w:hyperlink r:id="rId52">
         <w:r>
           <w:rPr>
             <w:rStyle w:val="Hyperlink"/>
@@ -5013,8 +6010,8 @@
         <w:t xml:space="preserve">.</w:t>
       </w:r>
     </w:p>
-    <w:bookmarkEnd w:id="49"/>
-    <w:bookmarkStart w:id="50" w:name="ref-dubuisson2011"/>
+    <w:bookmarkEnd w:id="53"/>
+    <w:bookmarkStart w:id="54" w:name="ref-dubuisson2011"/>
     <w:p>
       <w:pPr>
         <w:pStyle w:val="Bibliography"/>
@@ -5057,20 +6054,20 @@
         <w:t xml:space="preserve">51 (3): 304‑23.</w:t>
       </w:r>
     </w:p>
-    <w:bookmarkEnd w:id="50"/>
-    <w:bookmarkStart w:id="51" w:name="ref-filserplichon2004"/>
+    <w:bookmarkEnd w:id="54"/>
+    <w:bookmarkStart w:id="56" w:name="ref-feldmann2015"/>
     <w:p>
       <w:pPr>
         <w:pStyle w:val="Bibliography"/>
       </w:pPr>
       <w:r>
-        <w:t xml:space="preserve">Filser, Marc, et Véronique Plichon. 2004.</w:t>
-      </w:r>
-      <w:r>
-        <w:t xml:space="preserve"> </w:t>
-      </w:r>
-      <w:r>
-        <w:t xml:space="preserve">« La valeur du comportement de magasinage : statut théorique et apports au positionnement de l’enseigne »</w:t>
+        <w:t xml:space="preserve">Feldmann, Corinna, et Ulrich Hamm. 2015.</w:t>
+      </w:r>
+      <w:r>
+        <w:t xml:space="preserve"> </w:t>
+      </w:r>
+      <w:r>
+        <w:t xml:space="preserve">« Consumers’ perceptions and preferences for local food: A review »</w:t>
       </w:r>
       <w:r>
         <w:t xml:space="preserve">.</w:t>
@@ -5083,29 +6080,43 @@
           <w:i/>
           <w:iCs/>
         </w:rPr>
-        <w:t xml:space="preserve">Revue Française de Gestion</w:t>
-      </w:r>
-      <w:r>
-        <w:t xml:space="preserve"> </w:t>
-      </w:r>
-      <w:r>
-        <w:t xml:space="preserve">30 (148): 29‑43.</w:t>
-      </w:r>
-    </w:p>
-    <w:bookmarkEnd w:id="51"/>
-    <w:bookmarkStart w:id="53" w:name="ref-goodman2002"/>
+        <w:t xml:space="preserve">Food Quality and Preference</w:t>
+      </w:r>
+      <w:r>
+        <w:t xml:space="preserve"> </w:t>
+      </w:r>
+      <w:r>
+        <w:t xml:space="preserve">40: 152‑64.</w:t>
+      </w:r>
+      <w:r>
+        <w:t xml:space="preserve"> </w:t>
+      </w:r>
+      <w:hyperlink r:id="rId55">
+        <w:r>
+          <w:rPr>
+            <w:rStyle w:val="Hyperlink"/>
+          </w:rPr>
+          <w:t xml:space="preserve">https://doi.org/10.1016/j.foodqual.2014.09.014</w:t>
+        </w:r>
+      </w:hyperlink>
+      <w:r>
+        <w:t xml:space="preserve">.</w:t>
+      </w:r>
+    </w:p>
+    <w:bookmarkEnd w:id="56"/>
+    <w:bookmarkStart w:id="57" w:name="ref-filserplichon2004"/>
     <w:p>
       <w:pPr>
         <w:pStyle w:val="Bibliography"/>
       </w:pPr>
       <w:r>
-        <w:t xml:space="preserve">Goodman, David, et E. Melanie DuPuis. 2002.</w:t>
-      </w:r>
-      <w:r>
-        <w:t xml:space="preserve"> </w:t>
-      </w:r>
-      <w:r>
-        <w:t xml:space="preserve">« Knowing food and growing food: Beyond the production–consumption debate in the sociology of agriculture »</w:t>
+        <w:t xml:space="preserve">Filser, Marc, et Véronique Plichon. 2004.</w:t>
+      </w:r>
+      <w:r>
+        <w:t xml:space="preserve"> </w:t>
+      </w:r>
+      <w:r>
+        <w:t xml:space="preserve">« La valeur du comportement de magasinage : statut théorique et apports au positionnement de l’enseigne »</w:t>
       </w:r>
       <w:r>
         <w:t xml:space="preserve">.</w:t>
@@ -5118,6 +6129,125 @@
           <w:i/>
           <w:iCs/>
         </w:rPr>
+        <w:t xml:space="preserve">Revue Française de Gestion</w:t>
+      </w:r>
+      <w:r>
+        <w:t xml:space="preserve"> </w:t>
+      </w:r>
+      <w:r>
+        <w:t xml:space="preserve">30 (148): 29‑43.</w:t>
+      </w:r>
+    </w:p>
+    <w:bookmarkEnd w:id="57"/>
+    <w:bookmarkStart w:id="58" w:name="ref-giampietri2016"/>
+    <w:p>
+      <w:pPr>
+        <w:pStyle w:val="Bibliography"/>
+      </w:pPr>
+      <w:r>
+        <w:t xml:space="preserve">Giampietri, Elisa, Adele Finco, et Teresa Del Giudice. 2016.</w:t>
+      </w:r>
+      <w:r>
+        <w:t xml:space="preserve"> </w:t>
+      </w:r>
+      <w:r>
+        <w:t xml:space="preserve">« Exploring consumers’ behaviour towards short food supply chains »</w:t>
+      </w:r>
+      <w:r>
+        <w:t xml:space="preserve">.</w:t>
+      </w:r>
+      <w:r>
+        <w:t xml:space="preserve"> </w:t>
+      </w:r>
+      <w:r>
+        <w:rPr>
+          <w:i/>
+          <w:iCs/>
+        </w:rPr>
+        <w:t xml:space="preserve">British Food Journal</w:t>
+      </w:r>
+      <w:r>
+        <w:t xml:space="preserve"> </w:t>
+      </w:r>
+      <w:r>
+        <w:t xml:space="preserve">118 (3): 618‑31.</w:t>
+      </w:r>
+    </w:p>
+    <w:bookmarkEnd w:id="58"/>
+    <w:bookmarkStart w:id="60" w:name="ref-giampietri2018"/>
+    <w:p>
+      <w:pPr>
+        <w:pStyle w:val="Bibliography"/>
+      </w:pPr>
+      <w:r>
+        <w:t xml:space="preserve">Giampietri, Elisa, Fabio Verneau, Teresa Del Giudice, Valentina Carfora, et Adele Finco. 2018.</w:t>
+      </w:r>
+      <w:r>
+        <w:t xml:space="preserve"> </w:t>
+      </w:r>
+      <w:r>
+        <w:t xml:space="preserve">« A theory of planned behaviour perspective for investigating the role of trust in consumer purchasing decision related to short food supply chains »</w:t>
+      </w:r>
+      <w:r>
+        <w:t xml:space="preserve">.</w:t>
+      </w:r>
+      <w:r>
+        <w:t xml:space="preserve"> </w:t>
+      </w:r>
+      <w:r>
+        <w:rPr>
+          <w:i/>
+          <w:iCs/>
+        </w:rPr>
+        <w:t xml:space="preserve">Food Quality and Preference</w:t>
+      </w:r>
+      <w:r>
+        <w:t xml:space="preserve"> </w:t>
+      </w:r>
+      <w:r>
+        <w:t xml:space="preserve">64: 160‑66.</w:t>
+      </w:r>
+      <w:r>
+        <w:t xml:space="preserve"> </w:t>
+      </w:r>
+      <w:hyperlink r:id="rId59">
+        <w:r>
+          <w:rPr>
+            <w:rStyle w:val="Hyperlink"/>
+          </w:rPr>
+          <w:t xml:space="preserve">https://doi.org/10.1016/j.foodqual.2017.09.012</w:t>
+        </w:r>
+      </w:hyperlink>
+      <w:r>
+        <w:t xml:space="preserve">.</w:t>
+      </w:r>
+    </w:p>
+    <w:bookmarkEnd w:id="60"/>
+    <w:bookmarkStart w:id="62" w:name="ref-goodman2002"/>
+    <w:p>
+      <w:pPr>
+        <w:pStyle w:val="Bibliography"/>
+      </w:pPr>
+      <w:r>
+        <w:t xml:space="preserve">Goodman, David, et E. Melanie DuPuis. 2002.</w:t>
+      </w:r>
+      <w:r>
+        <w:t xml:space="preserve"> </w:t>
+      </w:r>
+      <w:r>
+        <w:t xml:space="preserve">« Knowing food and growing food: Beyond the production–consumption debate in the sociology of agriculture »</w:t>
+      </w:r>
+      <w:r>
+        <w:t xml:space="preserve">.</w:t>
+      </w:r>
+      <w:r>
+        <w:t xml:space="preserve"> </w:t>
+      </w:r>
+      <w:r>
+        <w:rPr>
+          <w:i/>
+          <w:iCs/>
+        </w:rPr>
         <w:t xml:space="preserve">Sociologia Ruralis</w:t>
       </w:r>
       <w:r>
@@ -5129,7 +6259,7 @@
       <w:r>
         <w:t xml:space="preserve"> </w:t>
       </w:r>
-      <w:hyperlink r:id="rId52">
+      <w:hyperlink r:id="rId61">
         <w:r>
           <w:rPr>
             <w:rStyle w:val="Hyperlink"/>
@@ -5141,8 +6271,8 @@
         <w:t xml:space="preserve">.</w:t>
       </w:r>
     </w:p>
-    <w:bookmarkEnd w:id="53"/>
-    <w:bookmarkStart w:id="55" w:name="ref-herzig2025"/>
+    <w:bookmarkEnd w:id="62"/>
+    <w:bookmarkStart w:id="64" w:name="ref-herzig2025"/>
     <w:p>
       <w:pPr>
         <w:pStyle w:val="Bibliography"/>
@@ -5178,7 +6308,7 @@
       <w:r>
         <w:t xml:space="preserve"> </w:t>
       </w:r>
-      <w:hyperlink r:id="rId54">
+      <w:hyperlink r:id="rId63">
         <w:r>
           <w:rPr>
             <w:rStyle w:val="Hyperlink"/>
@@ -5190,14 +6320,14 @@
         <w:t xml:space="preserve">.</w:t>
       </w:r>
     </w:p>
-    <w:bookmarkEnd w:id="55"/>
-    <w:bookmarkStart w:id="56" w:name="ref-lamine2008"/>
+    <w:bookmarkEnd w:id="64"/>
+    <w:bookmarkStart w:id="65" w:name="ref-kneafsey2013"/>
     <w:p>
       <w:pPr>
         <w:pStyle w:val="Bibliography"/>
       </w:pPr>
       <w:r>
-        <w:t xml:space="preserve">Lamine, Claire, et Nathalie Perrot. 2008.</w:t>
+        <w:t xml:space="preserve">Kneafsey, Moya, Laura Venn, Ulrich Schmutz, et al. 2013.</w:t>
       </w:r>
       <w:r>
         <w:t xml:space="preserve"> </w:t>
@@ -5207,29 +6337,73 @@
           <w:i/>
           <w:iCs/>
         </w:rPr>
-        <w:t xml:space="preserve">Les AMAP : un nouveau pacte entre producteurs et consommateurs ?</w:t>
-      </w:r>
-      <w:r>
-        <w:t xml:space="preserve"> Yves Michel.</w:t>
-      </w:r>
-    </w:p>
-    <w:bookmarkEnd w:id="56"/>
-    <w:bookmarkStart w:id="58" w:name="ref-marechal2008"/>
-    <w:p>
-      <w:pPr>
-        <w:pStyle w:val="Bibliography"/>
-      </w:pPr>
-      <w:r>
-        <w:t xml:space="preserve">Maréchal, Gilles, éd. 2008.</w:t>
-      </w:r>
-      <w:r>
-        <w:t xml:space="preserve"> </w:t>
+        <w:t xml:space="preserve">Short food supply chains and local food systems in the</w:t>
       </w:r>
       <w:r>
         <w:rPr>
           <w:i/>
           <w:iCs/>
         </w:rPr>
+        <w:t xml:space="preserve"> </w:t>
+      </w:r>
+      <w:r>
+        <w:rPr>
+          <w:i/>
+          <w:iCs/>
+        </w:rPr>
+        <w:t xml:space="preserve">EU</w:t>
+      </w:r>
+      <w:r>
+        <w:rPr>
+          <w:i/>
+          <w:iCs/>
+        </w:rPr>
+        <w:t xml:space="preserve">: A state of play of their socio-economic characteristics</w:t>
+      </w:r>
+      <w:r>
+        <w:t xml:space="preserve">. Joint Research Centre, European Commission (JRC Scientific; Policy Reports, EUR 25911).</w:t>
+      </w:r>
+    </w:p>
+    <w:bookmarkEnd w:id="65"/>
+    <w:bookmarkStart w:id="66" w:name="ref-lamine2008"/>
+    <w:p>
+      <w:pPr>
+        <w:pStyle w:val="Bibliography"/>
+      </w:pPr>
+      <w:r>
+        <w:t xml:space="preserve">Lamine, Claire, et Nathalie Perrot. 2008.</w:t>
+      </w:r>
+      <w:r>
+        <w:t xml:space="preserve"> </w:t>
+      </w:r>
+      <w:r>
+        <w:rPr>
+          <w:i/>
+          <w:iCs/>
+        </w:rPr>
+        <w:t xml:space="preserve">Les AMAP : un nouveau pacte entre producteurs et consommateurs ?</w:t>
+      </w:r>
+      <w:r>
+        <w:t xml:space="preserve"> Yves Michel.</w:t>
+      </w:r>
+    </w:p>
+    <w:bookmarkEnd w:id="66"/>
+    <w:bookmarkStart w:id="68" w:name="ref-marechal2008"/>
+    <w:p>
+      <w:pPr>
+        <w:pStyle w:val="Bibliography"/>
+      </w:pPr>
+      <w:r>
+        <w:t xml:space="preserve">Maréchal, Gilles, éd. 2008.</w:t>
+      </w:r>
+      <w:r>
+        <w:t xml:space="preserve"> </w:t>
+      </w:r>
+      <w:r>
+        <w:rPr>
+          <w:i/>
+          <w:iCs/>
+        </w:rPr>
         <w:t xml:space="preserve">Les circuits courts alimentaires : bien manger dans les territoires</w:t>
       </w:r>
       <w:r>
@@ -5238,7 +6412,7 @@
       <w:r>
         <w:t xml:space="preserve"> </w:t>
       </w:r>
-      <w:hyperlink r:id="rId57">
+      <w:hyperlink r:id="rId67">
         <w:r>
           <w:rPr>
             <w:rStyle w:val="Hyperlink"/>
@@ -5250,8 +6424,8 @@
         <w:t xml:space="preserve">.</w:t>
       </w:r>
     </w:p>
-    <w:bookmarkEnd w:id="58"/>
-    <w:bookmarkStart w:id="59" w:name="ref-maa2009"/>
+    <w:bookmarkEnd w:id="68"/>
+    <w:bookmarkStart w:id="69" w:name="ref-maa2009"/>
     <w:p>
       <w:pPr>
         <w:pStyle w:val="Bibliography"/>
@@ -5273,20 +6447,20 @@
         <w:t xml:space="preserve">. Rapport institutionnel.</w:t>
       </w:r>
     </w:p>
-    <w:bookmarkEnd w:id="59"/>
-    <w:bookmarkStart w:id="60" w:name="ref-praly2014"/>
+    <w:bookmarkEnd w:id="69"/>
+    <w:bookmarkStart w:id="71" w:name="ref-mustapa2025"/>
     <w:p>
       <w:pPr>
         <w:pStyle w:val="Bibliography"/>
       </w:pPr>
       <w:r>
-        <w:t xml:space="preserve">Praly, Cécile, Carole Chazoule, Claire Delfosse, et Patrick Mundler. 2014.</w:t>
-      </w:r>
-      <w:r>
-        <w:t xml:space="preserve"> </w:t>
-      </w:r>
-      <w:r>
-        <w:t xml:space="preserve">« Les circuits de proximité, cadre d’analyse de la relocalisation des circuits alimentaires »</w:t>
+        <w:t xml:space="preserve">Mustapa, Muhammad Amir Adam, et Zein Kallas. 2025.</w:t>
+      </w:r>
+      <w:r>
+        <w:t xml:space="preserve"> </w:t>
+      </w:r>
+      <w:r>
+        <w:t xml:space="preserve">« Meta-analysis of consumer willingness to pay for short food supply chain products »</w:t>
       </w:r>
       <w:r>
         <w:t xml:space="preserve">.</w:t>
@@ -5299,38 +6473,43 @@
           <w:i/>
           <w:iCs/>
         </w:rPr>
-        <w:t xml:space="preserve">Géographie, économie, société</w:t>
-      </w:r>
-      <w:r>
-        <w:t xml:space="preserve"> </w:t>
-      </w:r>
-      <w:r>
-        <w:t xml:space="preserve">16 (4): 455‑78.</w:t>
-      </w:r>
-    </w:p>
-    <w:bookmarkEnd w:id="60"/>
-    <w:bookmarkStart w:id="61" w:name="ref-sage2003"/>
+        <w:t xml:space="preserve">Global Challenges</w:t>
+      </w:r>
+      <w:r>
+        <w:t xml:space="preserve"> </w:t>
+      </w:r>
+      <w:r>
+        <w:t xml:space="preserve">9 (3).</w:t>
+      </w:r>
+      <w:r>
+        <w:t xml:space="preserve"> </w:t>
+      </w:r>
+      <w:hyperlink r:id="rId70">
+        <w:r>
+          <w:rPr>
+            <w:rStyle w:val="Hyperlink"/>
+          </w:rPr>
+          <w:t xml:space="preserve">https://doi.org/10.1002/gch2.202400154</w:t>
+        </w:r>
+      </w:hyperlink>
+      <w:r>
+        <w:t xml:space="preserve">.</w:t>
+      </w:r>
+    </w:p>
+    <w:bookmarkEnd w:id="71"/>
+    <w:bookmarkStart w:id="73" w:name="ref-neslin2006"/>
     <w:p>
       <w:pPr>
         <w:pStyle w:val="Bibliography"/>
       </w:pPr>
       <w:r>
-        <w:t xml:space="preserve">Sage, Colin. 2003.</w:t>
-      </w:r>
-      <w:r>
-        <w:t xml:space="preserve"> </w:t>
-      </w:r>
-      <w:r>
-        <w:t xml:space="preserve">« Social embeddedness and relations of regard: Alternative ’good food’ networks in south-west</w:t>
-      </w:r>
-      <w:r>
-        <w:t xml:space="preserve"> </w:t>
-      </w:r>
-      <w:r>
-        <w:t xml:space="preserve">Ireland</w:t>
-      </w:r>
-      <w:r>
-        <w:t xml:space="preserve"> »</w:t>
+        <w:t xml:space="preserve">Neslin, Scott A., Dhruv Grewal, Robert Leghorn, et al. 2006.</w:t>
+      </w:r>
+      <w:r>
+        <w:t xml:space="preserve"> </w:t>
+      </w:r>
+      <w:r>
+        <w:t xml:space="preserve">« Challenges and opportunities in multichannel customer management »</w:t>
       </w:r>
       <w:r>
         <w:t xml:space="preserve">.</w:t>
@@ -5343,23 +6522,46 @@
           <w:i/>
           <w:iCs/>
         </w:rPr>
-        <w:t xml:space="preserve">Journal of Rural Studies</w:t>
-      </w:r>
-      <w:r>
-        <w:t xml:space="preserve"> </w:t>
-      </w:r>
-      <w:r>
-        <w:t xml:space="preserve">19 (1): 47‑60.</w:t>
-      </w:r>
-    </w:p>
-    <w:bookmarkEnd w:id="61"/>
-    <w:bookmarkStart w:id="62" w:name="ref-volle2012"/>
+        <w:t xml:space="preserve">Journal of Service Research</w:t>
+      </w:r>
+      <w:r>
+        <w:t xml:space="preserve"> </w:t>
+      </w:r>
+      <w:r>
+        <w:t xml:space="preserve">9 (2): 95‑112.</w:t>
+      </w:r>
+      <w:r>
+        <w:t xml:space="preserve"> </w:t>
+      </w:r>
+      <w:hyperlink r:id="rId72">
+        <w:r>
+          <w:rPr>
+            <w:rStyle w:val="Hyperlink"/>
+          </w:rPr>
+          <w:t xml:space="preserve">https://doi.org/10.1177/1094670506293559</w:t>
+        </w:r>
+      </w:hyperlink>
+      <w:r>
+        <w:t xml:space="preserve">.</w:t>
+      </w:r>
+    </w:p>
+    <w:bookmarkEnd w:id="73"/>
+    <w:bookmarkStart w:id="74" w:name="ref-praly2014"/>
     <w:p>
       <w:pPr>
         <w:pStyle w:val="Bibliography"/>
       </w:pPr>
       <w:r>
-        <w:t xml:space="preserve">Volle, Pierre, éd. 2012.</w:t>
+        <w:t xml:space="preserve">Praly, Cécile, Carole Chazoule, Claire Delfosse, et Patrick Mundler. 2014.</w:t>
+      </w:r>
+      <w:r>
+        <w:t xml:space="preserve"> </w:t>
+      </w:r>
+      <w:r>
+        <w:t xml:space="preserve">« Les circuits de proximité, cadre d’analyse de la relocalisation des circuits alimentaires »</w:t>
+      </w:r>
+      <w:r>
+        <w:t xml:space="preserve">.</w:t>
       </w:r>
       <w:r>
         <w:t xml:space="preserve"> </w:t>
@@ -5369,15 +6571,195 @@
           <w:i/>
           <w:iCs/>
         </w:rPr>
+        <w:t xml:space="preserve">Géographie, économie, société</w:t>
+      </w:r>
+      <w:r>
+        <w:t xml:space="preserve"> </w:t>
+      </w:r>
+      <w:r>
+        <w:t xml:space="preserve">16 (4): 455‑78.</w:t>
+      </w:r>
+    </w:p>
+    <w:bookmarkEnd w:id="74"/>
+    <w:bookmarkStart w:id="75" w:name="ref-sage2003"/>
+    <w:p>
+      <w:pPr>
+        <w:pStyle w:val="Bibliography"/>
+      </w:pPr>
+      <w:r>
+        <w:t xml:space="preserve">Sage, Colin. 2003.</w:t>
+      </w:r>
+      <w:r>
+        <w:t xml:space="preserve"> </w:t>
+      </w:r>
+      <w:r>
+        <w:t xml:space="preserve">« Social embeddedness and relations of regard: Alternative ’good food’ networks in south-west</w:t>
+      </w:r>
+      <w:r>
+        <w:t xml:space="preserve"> </w:t>
+      </w:r>
+      <w:r>
+        <w:t xml:space="preserve">Ireland</w:t>
+      </w:r>
+      <w:r>
+        <w:t xml:space="preserve"> »</w:t>
+      </w:r>
+      <w:r>
+        <w:t xml:space="preserve">.</w:t>
+      </w:r>
+      <w:r>
+        <w:t xml:space="preserve"> </w:t>
+      </w:r>
+      <w:r>
+        <w:rPr>
+          <w:i/>
+          <w:iCs/>
+        </w:rPr>
+        <w:t xml:space="preserve">Journal of Rural Studies</w:t>
+      </w:r>
+      <w:r>
+        <w:t xml:space="preserve"> </w:t>
+      </w:r>
+      <w:r>
+        <w:t xml:space="preserve">19 (1): 47‑60.</w:t>
+      </w:r>
+    </w:p>
+    <w:bookmarkEnd w:id="75"/>
+    <w:bookmarkStart w:id="77" w:name="ref-verhoef2015"/>
+    <w:p>
+      <w:pPr>
+        <w:pStyle w:val="Bibliography"/>
+      </w:pPr>
+      <w:r>
+        <w:t xml:space="preserve">Verhoef, Peter C., P. K. Kannan, et J. Jeffrey Inman. 2015.</w:t>
+      </w:r>
+      <w:r>
+        <w:t xml:space="preserve"> </w:t>
+      </w:r>
+      <w:r>
+        <w:t xml:space="preserve">« From multi-channel retailing to omni-channel retailing: Introduction to the special issue on multi-channel retailing »</w:t>
+      </w:r>
+      <w:r>
+        <w:t xml:space="preserve">.</w:t>
+      </w:r>
+      <w:r>
+        <w:t xml:space="preserve"> </w:t>
+      </w:r>
+      <w:r>
+        <w:rPr>
+          <w:i/>
+          <w:iCs/>
+        </w:rPr>
+        <w:t xml:space="preserve">Journal of Retailing</w:t>
+      </w:r>
+      <w:r>
+        <w:t xml:space="preserve"> </w:t>
+      </w:r>
+      <w:r>
+        <w:t xml:space="preserve">91 (2): 174‑81.</w:t>
+      </w:r>
+      <w:r>
+        <w:t xml:space="preserve"> </w:t>
+      </w:r>
+      <w:hyperlink r:id="rId76">
+        <w:r>
+          <w:rPr>
+            <w:rStyle w:val="Hyperlink"/>
+          </w:rPr>
+          <w:t xml:space="preserve">https://doi.org/10.1016/j.jretai.2015.02.005</w:t>
+        </w:r>
+      </w:hyperlink>
+      <w:r>
+        <w:t xml:space="preserve">.</w:t>
+      </w:r>
+    </w:p>
+    <w:bookmarkEnd w:id="77"/>
+    <w:bookmarkStart w:id="79" w:name="ref-vermeir2006"/>
+    <w:p>
+      <w:pPr>
+        <w:pStyle w:val="Bibliography"/>
+      </w:pPr>
+      <w:r>
+        <w:t xml:space="preserve">Vermeir, Iris, et Wim Verbeke. 2006.</w:t>
+      </w:r>
+      <w:r>
+        <w:t xml:space="preserve"> </w:t>
+      </w:r>
+      <w:r>
+        <w:t xml:space="preserve">« Sustainable food consumption: Exploring the consumer</w:t>
+      </w:r>
+      <w:r>
+        <w:t xml:space="preserve"> </w:t>
+      </w:r>
+      <w:r>
+        <w:t xml:space="preserve">“attitude–behavioral intention”</w:t>
+      </w:r>
+      <w:r>
+        <w:t xml:space="preserve"> </w:t>
+      </w:r>
+      <w:r>
+        <w:t xml:space="preserve">gap »</w:t>
+      </w:r>
+      <w:r>
+        <w:t xml:space="preserve">.</w:t>
+      </w:r>
+      <w:r>
+        <w:t xml:space="preserve"> </w:t>
+      </w:r>
+      <w:r>
+        <w:rPr>
+          <w:i/>
+          <w:iCs/>
+        </w:rPr>
+        <w:t xml:space="preserve">Journal of Agricultural and Environmental Ethics</w:t>
+      </w:r>
+      <w:r>
+        <w:t xml:space="preserve"> </w:t>
+      </w:r>
+      <w:r>
+        <w:t xml:space="preserve">19 (2): 169‑94.</w:t>
+      </w:r>
+      <w:r>
+        <w:t xml:space="preserve"> </w:t>
+      </w:r>
+      <w:hyperlink r:id="rId78">
+        <w:r>
+          <w:rPr>
+            <w:rStyle w:val="Hyperlink"/>
+          </w:rPr>
+          <w:t xml:space="preserve">https://doi.org/10.1007/s10806-005-5485-3</w:t>
+        </w:r>
+      </w:hyperlink>
+      <w:r>
+        <w:t xml:space="preserve">.</w:t>
+      </w:r>
+    </w:p>
+    <w:bookmarkEnd w:id="79"/>
+    <w:bookmarkStart w:id="80" w:name="ref-volle2012"/>
+    <w:p>
+      <w:pPr>
+        <w:pStyle w:val="Bibliography"/>
+      </w:pPr>
+      <w:r>
+        <w:t xml:space="preserve">Volle, Pierre, éd. 2012.</w:t>
+      </w:r>
+      <w:r>
+        <w:t xml:space="preserve"> </w:t>
+      </w:r>
+      <w:r>
+        <w:rPr>
+          <w:i/>
+          <w:iCs/>
+        </w:rPr>
         <w:t xml:space="preserve">Stratégie clients : points de vue d’experts sur le management de la relation client</w:t>
       </w:r>
       <w:r>
         <w:t xml:space="preserve">. Pearson.</w:t>
       </w:r>
     </w:p>
-    <w:bookmarkEnd w:id="62"/>
-    <w:bookmarkEnd w:id="63"/>
-    <w:bookmarkEnd w:id="64"/>
+    <w:bookmarkEnd w:id="80"/>
+    <w:bookmarkEnd w:id="81"/>
+    <w:bookmarkEnd w:id="82"/>
     <w:sectPr>
       <w:footnotePr>
         <w:numRestart w:val="eachSect"/>

</xml_diff>

<commit_message>
budget metric: report population mean (1.5%) and among-buyers mean (8.5%) side by side + method note on Q9 collection; update copil slide
</commit_message>
<xml_diff>
--- a/outputs/word/article_vente_directe.docx
+++ b/outputs/word/article_vente_directe.docx
@@ -1912,7 +1912,68 @@
         <w:t xml:space="preserve"> </w:t>
       </w:r>
       <w:r>
-        <w:t xml:space="preserve">Pour chaque canal fréquenté, le répondant a estimé la part (en %) de son budget alimentaire mensuel qui y est consacrée.</w:t>
+        <w:t xml:space="preserve">Pour chaque canal, le répondant a estimé la part (en %) de son budget alimentaire mensuel qui y est consacrée ; ces parts somment à 100 % par ménage, formant une décomposition complète du budget. Cette question n’a été posée qu’aux ménages fréquentant le canal</w:t>
+      </w:r>
+      <w:r>
+        <w:t xml:space="preserve"> </w:t>
+      </w:r>
+      <w:r>
+        <w:rPr>
+          <w:b/>
+          <w:bCs/>
+        </w:rPr>
+        <w:t xml:space="preserve">au moins une fois par mois</w:t>
+      </w:r>
+      <w:r>
+        <w:t xml:space="preserve"> </w:t>
+      </w:r>
+      <w:r>
+        <w:t xml:space="preserve">; les autres sont traités comme y consacrant une part nulle. Ce choix est cohérent — la part des acheteurs très occasionnels arrondit à une valeur négligeable — mais il implique que les parts de budget rapportées ici constituent un</w:t>
+      </w:r>
+      <w:r>
+        <w:t xml:space="preserve"> </w:t>
+      </w:r>
+      <w:r>
+        <w:rPr>
+          <w:b/>
+          <w:bCs/>
+        </w:rPr>
+        <w:t xml:space="preserve">plancher</w:t>
+      </w:r>
+      <w:r>
+        <w:t xml:space="preserve">, sous-estimant légèrement le poids des canaux à forte fréquentation occasionnelle. Nous distinguons systématiquement la part</w:t>
+      </w:r>
+      <w:r>
+        <w:t xml:space="preserve"> </w:t>
+      </w:r>
+      <w:r>
+        <w:rPr>
+          <w:b/>
+          <w:bCs/>
+        </w:rPr>
+        <w:t xml:space="preserve">moyenne sur l’ensemble des ménages</w:t>
+      </w:r>
+      <w:r>
+        <w:t xml:space="preserve"> </w:t>
+      </w:r>
+      <w:r>
+        <w:t xml:space="preserve">(poids économique du canal dans la population, seul indicateur comparable entre canaux et sommant à 100 %) de la part</w:t>
+      </w:r>
+      <w:r>
+        <w:t xml:space="preserve"> </w:t>
+      </w:r>
+      <w:r>
+        <w:rPr>
+          <w:b/>
+          <w:bCs/>
+        </w:rPr>
+        <w:t xml:space="preserve">moyenne parmi ses seuls acheteurs réguliers</w:t>
+      </w:r>
+      <w:r>
+        <w:t xml:space="preserve"> </w:t>
+      </w:r>
+      <w:r>
+        <w:t xml:space="preserve">(intensité de la pratique chez ceux qui l’adoptent).</w:t>
       </w:r>
     </w:p>
     <w:p>
@@ -3568,6 +3629,88 @@
         <w:pStyle w:val="BodyText"/>
       </w:pPr>
       <w:r>
+        <w:t xml:space="preserve">Ce poids budgétaire doit se lire à deux échelles complémentaires.</w:t>
+      </w:r>
+      <w:r>
+        <w:t xml:space="preserve"> </w:t>
+      </w:r>
+      <w:r>
+        <w:rPr>
+          <w:b/>
+          <w:bCs/>
+        </w:rPr>
+        <w:t xml:space="preserve">Rapportée à l’ensemble des ménages</w:t>
+      </w:r>
+      <w:r>
+        <w:t xml:space="preserve">, la vente directe aux agriculteurs (canal 7) ne représente que</w:t>
+      </w:r>
+      <w:r>
+        <w:t xml:space="preserve"> </w:t>
+      </w:r>
+      <w:r>
+        <w:rPr>
+          <w:b/>
+          <w:bCs/>
+        </w:rPr>
+        <w:t xml:space="preserve">1,5 % du budget</w:t>
+      </w:r>
+      <w:r>
+        <w:t xml:space="preserve"> </w:t>
+      </w:r>
+      <w:r>
+        <w:t xml:space="preserve">alimentaire — soit environ 7 € par mois pour le ménage moyen : c’est son</w:t>
+      </w:r>
+      <w:r>
+        <w:t xml:space="preserve"> </w:t>
+      </w:r>
+      <w:r>
+        <w:rPr>
+          <w:b/>
+          <w:bCs/>
+        </w:rPr>
+        <w:t xml:space="preserve">poids économique</w:t>
+      </w:r>
+      <w:r>
+        <w:t xml:space="preserve"> </w:t>
+      </w:r>
+      <w:r>
+        <w:t xml:space="preserve">dans la population, comparable à celui des autres canaux (58,5 % pour l’hypermarché) et cohérent avec la décomposition à 100 % du budget. Mais</w:t>
+      </w:r>
+      <w:r>
+        <w:t xml:space="preserve"> </w:t>
+      </w:r>
+      <w:r>
+        <w:rPr>
+          <w:b/>
+          <w:bCs/>
+        </w:rPr>
+        <w:t xml:space="preserve">rapportée aux seuls ménages qui la pratiquent régulièrement</w:t>
+      </w:r>
+      <w:r>
+        <w:t xml:space="preserve">, elle en pèse</w:t>
+      </w:r>
+      <w:r>
+        <w:t xml:space="preserve"> </w:t>
+      </w:r>
+      <w:r>
+        <w:rPr>
+          <w:b/>
+          <w:bCs/>
+        </w:rPr>
+        <w:t xml:space="preserve">8,5 %</w:t>
+      </w:r>
+      <w:r>
+        <w:t xml:space="preserve"> </w:t>
+      </w:r>
+      <w:r>
+        <w:t xml:space="preserve">(près de 42 € par mois) : chez ses adeptes, elle n’a donc rien d’anecdotique. Un canal marginal à l’échelle du pays, mais installé dans le budget d’une minorité active.</w:t>
+      </w:r>
+    </w:p>
+    <w:p>
+      <w:pPr>
+        <w:pStyle w:val="BodyText"/>
+      </w:pPr>
+      <w:r>
         <w:t xml:space="preserve">Le contraste entre cette</w:t>
       </w:r>
       <w:r>
@@ -3584,23 +3727,23 @@
         <w:t xml:space="preserve"> </w:t>
       </w:r>
       <w:r>
-        <w:t xml:space="preserve">(deux ménages sur trois) et la</w:t>
-      </w:r>
-      <w:r>
-        <w:t xml:space="preserve"> </w:t>
-      </w:r>
-      <w:r>
-        <w:rPr>
-          <w:b/>
-          <w:bCs/>
-        </w:rPr>
-        <w:t xml:space="preserve">faible part de budget</w:t>
-      </w:r>
-      <w:r>
-        <w:t xml:space="preserve"> </w:t>
-      </w:r>
-      <w:r>
-        <w:t xml:space="preserve">(1,5 % pour le canal dédié) constitue le résultat central de l’article. Il confirme l’hypothèse H1 : la vente directe n’est pas, pour l’immense majorité des ménages, un canal de substitution à la grande distribution, mais un</w:t>
+        <w:t xml:space="preserve">(deux ménages sur trois) et ce</w:t>
+      </w:r>
+      <w:r>
+        <w:t xml:space="preserve"> </w:t>
+      </w:r>
+      <w:r>
+        <w:rPr>
+          <w:b/>
+          <w:bCs/>
+        </w:rPr>
+        <w:t xml:space="preserve">faible poids économique</w:t>
+      </w:r>
+      <w:r>
+        <w:t xml:space="preserve"> </w:t>
+      </w:r>
+      <w:r>
+        <w:t xml:space="preserve">(1,5 % du budget national) constitue le résultat central de l’article. Il confirme l’hypothèse H1 : la vente directe n’est pas, pour l’immense majorité des ménages, un canal de substitution à la grande distribution, mais un</w:t>
       </w:r>
       <w:r>
         <w:t xml:space="preserve"> </w:t>
@@ -3613,7 +3756,7 @@
         <w:t xml:space="preserve">complément ciblé</w:t>
       </w:r>
       <w:r>
-        <w:t xml:space="preserve">, mobilisé occasionnellement et pour une fraction réduite des dépenses. Il valide aussi H3 : l’adhésion déclarée (65 % de pratiquants) contraste fortement avec le poids budgétaire réel (~1,5 %) — une manifestation directe de l’</w:t>
+        <w:t xml:space="preserve">, mobilisé occasionnellement et pour une fraction réduite des dépenses. Il valide aussi H3 : l’adhésion déclarée (65 % de pratiquants) contraste fortement avec le poids budgétaire réel (1,5 %) — une manifestation directe de l’</w:t>
       </w:r>
       <w:r>
         <w:rPr>

</xml_diff>